<commit_message>
docs: update docs APA
</commit_message>
<xml_diff>
--- a/TRIMESTRE 1/Componente Metodologico/Farmatech.docx
+++ b/TRIMESTRE 1/Componente Metodologico/Farmatech.docx
@@ -62,10 +62,7 @@
         <w:jc w:val="center"/>
       </w:pPr>
       <w:r>
-        <w:t xml:space="preserve">Nombres y </w:t>
-      </w:r>
-      <w:r>
-        <w:t>Apellidos Estudiante</w:t>
+        <w:t>Oscar Fabian León Giménez</w:t>
       </w:r>
     </w:p>
     <w:p>
@@ -73,6 +70,9 @@
         <w:pStyle w:val="Sinespaciado"/>
         <w:jc w:val="center"/>
       </w:pPr>
+      <w:r>
+        <w:t>Jhon Alexander Capera Tique</w:t>
+      </w:r>
     </w:p>
     <w:p>
       <w:pPr>
@@ -107,7 +107,7 @@
         <w:jc w:val="center"/>
       </w:pPr>
       <w:r>
-        <w:t>Nombres y Apellidos</w:t>
+        <w:t>Pendiente</w:t>
       </w:r>
     </w:p>
     <w:p>
@@ -140,7 +140,7 @@
         <w:jc w:val="center"/>
       </w:pPr>
       <w:r>
-        <w:t>Universidad Nacional Abierta y a Distancia UNAD</w:t>
+        <w:t>Servicio Nacional de Aprendizaje (SENA)</w:t>
       </w:r>
     </w:p>
     <w:p>
@@ -149,13 +149,7 @@
         <w:jc w:val="center"/>
       </w:pPr>
       <w:r>
-        <w:t>Escuela de Ciencias Sociales Artes y Humanidades</w:t>
-      </w:r>
-      <w:r>
-        <w:t xml:space="preserve"> </w:t>
-      </w:r>
-      <w:r>
-        <w:t>ECSAH</w:t>
+        <w:t>Centro de Electricidad Electrónica y Telecomunicaciones</w:t>
       </w:r>
     </w:p>
     <w:p>
@@ -170,13 +164,7 @@
         <w:rPr>
           <w:color w:val="000000" w:themeColor="text1"/>
         </w:rPr>
-        <w:t>Program</w:t>
-      </w:r>
-      <w:r>
-        <w:rPr>
-          <w:color w:val="000000" w:themeColor="text1"/>
-        </w:rPr>
-        <w:t>a</w:t>
+        <w:t>Análisis y Desarrollo de Software</w:t>
       </w:r>
     </w:p>
     <w:p>
@@ -188,242 +176,8 @@
         <w:t>202</w:t>
       </w:r>
       <w:r>
-        <w:t>5</w:t>
-      </w:r>
-    </w:p>
-    <w:p>
-      <w:pPr>
-        <w:pStyle w:val="Sinespaciado"/>
-        <w:jc w:val="center"/>
-        <w:rPr>
-          <w:b/>
-        </w:rPr>
-      </w:pPr>
-      <w:r>
-        <w:rPr>
-          <w:b/>
-        </w:rPr>
-        <w:lastRenderedPageBreak/>
-        <w:t>Agradecimientos</w:t>
-      </w:r>
-    </w:p>
-    <w:p>
-      <w:pPr>
-        <w:pStyle w:val="Sinespaciado"/>
-        <w:jc w:val="center"/>
-      </w:pPr>
-      <w:r>
-        <w:t>Esta página es opcional</w:t>
-      </w:r>
-      <w:r>
-        <w:t>.</w:t>
-      </w:r>
-    </w:p>
-    <w:p>
-      <w:pPr>
-        <w:pStyle w:val="Sinespaciado"/>
-      </w:pPr>
-    </w:p>
-    <w:p>
-      <w:pPr>
-        <w:pStyle w:val="Sinespaciado"/>
-      </w:pPr>
-    </w:p>
-    <w:p>
-      <w:pPr>
-        <w:pStyle w:val="Sinespaciado"/>
-      </w:pPr>
-    </w:p>
-    <w:p>
-      <w:pPr>
-        <w:pStyle w:val="Sinespaciado"/>
-      </w:pPr>
-    </w:p>
-    <w:p>
-      <w:pPr>
-        <w:pStyle w:val="Sinespaciado"/>
-      </w:pPr>
-    </w:p>
-    <w:p>
-      <w:pPr>
-        <w:pStyle w:val="Sinespaciado"/>
-      </w:pPr>
-    </w:p>
-    <w:p>
-      <w:pPr>
-        <w:pStyle w:val="Sinespaciado"/>
-      </w:pPr>
-    </w:p>
-    <w:p>
-      <w:pPr>
-        <w:pStyle w:val="Sinespaciado"/>
-      </w:pPr>
-    </w:p>
-    <w:p>
-      <w:pPr>
-        <w:pStyle w:val="Sinespaciado"/>
-      </w:pPr>
-    </w:p>
-    <w:p>
-      <w:pPr>
-        <w:pStyle w:val="Sinespaciado"/>
-      </w:pPr>
-    </w:p>
-    <w:p>
-      <w:pPr>
-        <w:pStyle w:val="Sinespaciado"/>
-      </w:pPr>
-    </w:p>
-    <w:p>
-      <w:pPr>
-        <w:pStyle w:val="Sinespaciado"/>
-      </w:pPr>
-    </w:p>
-    <w:p>
-      <w:pPr>
-        <w:pStyle w:val="Sinespaciado"/>
-      </w:pPr>
-    </w:p>
-    <w:p>
-      <w:pPr>
-        <w:pStyle w:val="Sinespaciado"/>
-      </w:pPr>
-    </w:p>
-    <w:p>
-      <w:pPr>
-        <w:pStyle w:val="Sinespaciado"/>
-      </w:pPr>
-    </w:p>
-    <w:p>
-      <w:pPr>
-        <w:pStyle w:val="Sinespaciado"/>
-      </w:pPr>
-    </w:p>
-    <w:p>
-      <w:pPr>
-        <w:pStyle w:val="Sinespaciado"/>
-      </w:pPr>
-    </w:p>
-    <w:p>
-      <w:pPr>
-        <w:pStyle w:val="Sinespaciado"/>
-      </w:pPr>
-    </w:p>
-    <w:p>
-      <w:pPr>
-        <w:pStyle w:val="Sinespaciado"/>
-      </w:pPr>
-    </w:p>
-    <w:p>
-      <w:pPr>
-        <w:pStyle w:val="Sinespaciado"/>
-      </w:pPr>
-    </w:p>
-    <w:p>
-      <w:pPr>
-        <w:pStyle w:val="Sinespaciado"/>
-      </w:pPr>
-    </w:p>
-    <w:p>
-      <w:pPr>
-        <w:pStyle w:val="Sinespaciado"/>
-        <w:jc w:val="center"/>
-        <w:rPr>
-          <w:b/>
-        </w:rPr>
-      </w:pPr>
-      <w:r>
-        <w:rPr>
-          <w:b/>
-        </w:rPr>
-        <w:lastRenderedPageBreak/>
-        <w:t>Resumen</w:t>
-      </w:r>
-    </w:p>
-    <w:p>
-      <w:pPr>
-        <w:pStyle w:val="Sinespaciado"/>
-      </w:pPr>
-      <w:r>
-        <w:t>Un resumen debe ser un texto breve y claro sobre el contenido de tu artículo</w:t>
-      </w:r>
-      <w:r>
-        <w:t xml:space="preserve">, </w:t>
-      </w:r>
-      <w:r>
-        <w:t xml:space="preserve">Los límites de palabras varían </w:t>
-      </w:r>
-      <w:proofErr w:type="gramStart"/>
-      <w:r>
-        <w:t>de acuerdo al</w:t>
-      </w:r>
-      <w:proofErr w:type="gramEnd"/>
-      <w:r>
-        <w:t xml:space="preserve"> destino de tu </w:t>
-      </w:r>
-      <w:proofErr w:type="gramStart"/>
-      <w:r>
-        <w:t>documento</w:t>
-      </w:r>
-      <w:proofErr w:type="gramEnd"/>
-      <w:r>
-        <w:t xml:space="preserve"> pero, por lo general, varían de 150 a 250 palabras. Debe permitir a los lectores entender el contenido de un artículo rápidamente y, así como el título, debe estar escrito de tal modo que personas puedan encontrarlo cuando busquen desde las bases de datos el asunto de tu texto.</w:t>
-      </w:r>
-    </w:p>
-    <w:p>
-      <w:pPr>
-        <w:pStyle w:val="APA"/>
-        <w:ind w:firstLine="708"/>
-        <w:rPr>
-          <w:rFonts w:cs="Times New Roman"/>
-          <w:szCs w:val="24"/>
-        </w:rPr>
-      </w:pPr>
-      <w:r>
-        <w:rPr>
-          <w:rFonts w:cs="Times New Roman"/>
-          <w:b/>
-          <w:bCs/>
-          <w:i/>
-          <w:szCs w:val="24"/>
-        </w:rPr>
-        <w:t>Palabras clave</w:t>
-      </w:r>
-      <w:r>
-        <w:rPr>
-          <w:rFonts w:cs="Times New Roman"/>
-          <w:b/>
-          <w:bCs/>
-          <w:szCs w:val="24"/>
-        </w:rPr>
-        <w:t>:</w:t>
-      </w:r>
-      <w:r>
-        <w:rPr>
-          <w:rFonts w:cs="Times New Roman"/>
-          <w:szCs w:val="24"/>
-        </w:rPr>
-        <w:t xml:space="preserve"> no pueden ser más de cinco y recuerde que son palabras y no frases o conjuntos de varias palabras.</w:t>
-      </w:r>
-    </w:p>
-    <w:p/>
-    <w:p/>
-    <w:p/>
-    <w:p/>
-    <w:p/>
-    <w:p/>
-    <w:p/>
-    <w:p/>
-    <w:p/>
-    <w:p/>
-    <w:p/>
-    <w:p/>
-    <w:p/>
-    <w:p/>
-    <w:p>
-      <w:pPr>
-        <w:ind w:firstLine="0"/>
-      </w:pPr>
+        <w:t>6</w:t>
+      </w:r>
     </w:p>
     <w:p>
       <w:pPr>
@@ -449,7 +203,7 @@
           <w:noProof/>
           <w:color w:val="auto"/>
           <w:kern w:val="2"/>
-          <w:lang w:val="es-CO" w:eastAsia="es-CO"/>
+          <w:lang w:val="es-MX" w:eastAsia="es-MX"/>
           <w14:ligatures w14:val="standardContextual"/>
         </w:rPr>
       </w:pPr>
@@ -462,7 +216,7 @@
       <w:r>
         <w:fldChar w:fldCharType="separate"/>
       </w:r>
-      <w:hyperlink w:anchor="_Toc228557402" w:history="1">
+      <w:hyperlink w:anchor="_Toc229071761" w:history="1">
         <w:r>
           <w:rPr>
             <w:rStyle w:val="Hipervnculo"/>
@@ -489,7 +243,7 @@
             <w:noProof/>
             <w:webHidden/>
           </w:rPr>
-          <w:instrText xml:space="preserve"> PAGEREF _Toc228557402 \h </w:instrText>
+          <w:instrText xml:space="preserve"> PAGEREF _Toc229071761 \h </w:instrText>
         </w:r>
         <w:r>
           <w:rPr>
@@ -509,7 +263,7 @@
             <w:noProof/>
             <w:webHidden/>
           </w:rPr>
-          <w:t>10</w:t>
+          <w:t>3</w:t>
         </w:r>
         <w:r>
           <w:rPr>
@@ -528,17 +282,17 @@
           <w:noProof/>
           <w:color w:val="auto"/>
           <w:kern w:val="2"/>
-          <w:lang w:val="es-CO" w:eastAsia="es-CO"/>
+          <w:lang w:val="es-MX" w:eastAsia="es-MX"/>
           <w14:ligatures w14:val="standardContextual"/>
         </w:rPr>
       </w:pPr>
-      <w:hyperlink w:anchor="_Toc228557403" w:history="1">
+      <w:hyperlink w:anchor="_Toc229071762" w:history="1">
         <w:r>
           <w:rPr>
             <w:rStyle w:val="Hipervnculo"/>
             <w:noProof/>
           </w:rPr>
-          <w:t>Plantamiento del Problema</w:t>
+          <w:t>Nombre Técnico</w:t>
         </w:r>
         <w:r>
           <w:rPr>
@@ -559,7 +313,7 @@
             <w:noProof/>
             <w:webHidden/>
           </w:rPr>
-          <w:instrText xml:space="preserve"> PAGEREF _Toc228557403 \h </w:instrText>
+          <w:instrText xml:space="preserve"> PAGEREF _Toc229071762 \h </w:instrText>
         </w:r>
         <w:r>
           <w:rPr>
@@ -579,7 +333,80 @@
             <w:noProof/>
             <w:webHidden/>
           </w:rPr>
-          <w:t>11</w:t>
+          <w:t>4</w:t>
+        </w:r>
+        <w:r>
+          <w:rPr>
+            <w:noProof/>
+            <w:webHidden/>
+          </w:rPr>
+          <w:fldChar w:fldCharType="end"/>
+        </w:r>
+      </w:hyperlink>
+    </w:p>
+    <w:p>
+      <w:pPr>
+        <w:pStyle w:val="TDC2"/>
+        <w:tabs>
+          <w:tab w:val="right" w:leader="dot" w:pos="9350"/>
+        </w:tabs>
+        <w:rPr>
+          <w:rFonts w:asciiTheme="minorHAnsi" w:eastAsiaTheme="minorEastAsia" w:hAnsiTheme="minorHAnsi" w:cstheme="minorBidi"/>
+          <w:noProof/>
+          <w:color w:val="auto"/>
+          <w:kern w:val="2"/>
+          <w:lang w:val="es-MX" w:eastAsia="es-MX"/>
+          <w14:ligatures w14:val="standardContextual"/>
+        </w:rPr>
+      </w:pPr>
+      <w:hyperlink w:anchor="_Toc229071763" w:history="1">
+        <w:r>
+          <w:rPr>
+            <w:rStyle w:val="Hipervnculo"/>
+            <w:noProof/>
+          </w:rPr>
+          <w:t>Nombre Comercial</w:t>
+        </w:r>
+        <w:r>
+          <w:rPr>
+            <w:noProof/>
+            <w:webHidden/>
+          </w:rPr>
+          <w:tab/>
+        </w:r>
+        <w:r>
+          <w:rPr>
+            <w:noProof/>
+            <w:webHidden/>
+          </w:rPr>
+          <w:fldChar w:fldCharType="begin"/>
+        </w:r>
+        <w:r>
+          <w:rPr>
+            <w:noProof/>
+            <w:webHidden/>
+          </w:rPr>
+          <w:instrText xml:space="preserve"> PAGEREF _Toc229071763 \h </w:instrText>
+        </w:r>
+        <w:r>
+          <w:rPr>
+            <w:noProof/>
+            <w:webHidden/>
+          </w:rPr>
+        </w:r>
+        <w:r>
+          <w:rPr>
+            <w:noProof/>
+            <w:webHidden/>
+          </w:rPr>
+          <w:fldChar w:fldCharType="separate"/>
+        </w:r>
+        <w:r>
+          <w:rPr>
+            <w:noProof/>
+            <w:webHidden/>
+          </w:rPr>
+          <w:t>4</w:t>
         </w:r>
         <w:r>
           <w:rPr>
@@ -598,17 +425,17 @@
           <w:noProof/>
           <w:color w:val="auto"/>
           <w:kern w:val="2"/>
-          <w:lang w:val="es-CO" w:eastAsia="es-CO"/>
+          <w:lang w:val="es-MX" w:eastAsia="es-MX"/>
           <w14:ligatures w14:val="standardContextual"/>
         </w:rPr>
       </w:pPr>
-      <w:hyperlink w:anchor="_Toc228557404" w:history="1">
+      <w:hyperlink w:anchor="_Toc229071764" w:history="1">
         <w:r>
           <w:rPr>
             <w:rStyle w:val="Hipervnculo"/>
             <w:noProof/>
           </w:rPr>
-          <w:t>Pregunta del Proyecto</w:t>
+          <w:t>Planteamiento del Problema</w:t>
         </w:r>
         <w:r>
           <w:rPr>
@@ -629,7 +456,7 @@
             <w:noProof/>
             <w:webHidden/>
           </w:rPr>
-          <w:instrText xml:space="preserve"> PAGEREF _Toc228557404 \h </w:instrText>
+          <w:instrText xml:space="preserve"> PAGEREF _Toc229071764 \h </w:instrText>
         </w:r>
         <w:r>
           <w:rPr>
@@ -649,7 +476,7 @@
             <w:noProof/>
             <w:webHidden/>
           </w:rPr>
-          <w:t>11</w:t>
+          <w:t>4</w:t>
         </w:r>
         <w:r>
           <w:rPr>
@@ -668,17 +495,17 @@
           <w:noProof/>
           <w:color w:val="auto"/>
           <w:kern w:val="2"/>
-          <w:lang w:val="es-CO" w:eastAsia="es-CO"/>
+          <w:lang w:val="es-MX" w:eastAsia="es-MX"/>
           <w14:ligatures w14:val="standardContextual"/>
         </w:rPr>
       </w:pPr>
-      <w:hyperlink w:anchor="_Toc228557405" w:history="1">
+      <w:hyperlink w:anchor="_Toc229071765" w:history="1">
         <w:r>
           <w:rPr>
             <w:rStyle w:val="Hipervnculo"/>
             <w:noProof/>
           </w:rPr>
-          <w:t>Justificacion</w:t>
+          <w:t>Pregunta del Proyecto</w:t>
         </w:r>
         <w:r>
           <w:rPr>
@@ -699,7 +526,7 @@
             <w:noProof/>
             <w:webHidden/>
           </w:rPr>
-          <w:instrText xml:space="preserve"> PAGEREF _Toc228557405 \h </w:instrText>
+          <w:instrText xml:space="preserve"> PAGEREF _Toc229071765 \h </w:instrText>
         </w:r>
         <w:r>
           <w:rPr>
@@ -719,7 +546,7 @@
             <w:noProof/>
             <w:webHidden/>
           </w:rPr>
-          <w:t>12</w:t>
+          <w:t>5</w:t>
         </w:r>
         <w:r>
           <w:rPr>
@@ -738,17 +565,17 @@
           <w:noProof/>
           <w:color w:val="auto"/>
           <w:kern w:val="2"/>
-          <w:lang w:val="es-CO" w:eastAsia="es-CO"/>
+          <w:lang w:val="es-MX" w:eastAsia="es-MX"/>
           <w14:ligatures w14:val="standardContextual"/>
         </w:rPr>
       </w:pPr>
-      <w:hyperlink w:anchor="_Toc228557406" w:history="1">
+      <w:hyperlink w:anchor="_Toc229071766" w:history="1">
         <w:r>
           <w:rPr>
             <w:rStyle w:val="Hipervnculo"/>
             <w:noProof/>
           </w:rPr>
-          <w:t>Objetivos</w:t>
+          <w:t>Justificación</w:t>
         </w:r>
         <w:r>
           <w:rPr>
@@ -769,7 +596,7 @@
             <w:noProof/>
             <w:webHidden/>
           </w:rPr>
-          <w:instrText xml:space="preserve"> PAGEREF _Toc228557406 \h </w:instrText>
+          <w:instrText xml:space="preserve"> PAGEREF _Toc229071766 \h </w:instrText>
         </w:r>
         <w:r>
           <w:rPr>
@@ -789,183 +616,7 @@
             <w:noProof/>
             <w:webHidden/>
           </w:rPr>
-          <w:t>14</w:t>
-        </w:r>
-        <w:r>
-          <w:rPr>
-            <w:noProof/>
-            <w:webHidden/>
-          </w:rPr>
-          <w:fldChar w:fldCharType="end"/>
-        </w:r>
-      </w:hyperlink>
-    </w:p>
-    <w:p>
-      <w:pPr>
-        <w:pStyle w:val="TDC2"/>
-        <w:tabs>
-          <w:tab w:val="right" w:leader="dot" w:pos="9350"/>
-        </w:tabs>
-        <w:rPr>
-          <w:rFonts w:asciiTheme="minorHAnsi" w:eastAsiaTheme="minorEastAsia" w:hAnsiTheme="minorHAnsi" w:cstheme="minorBidi"/>
-          <w:noProof/>
-          <w:color w:val="auto"/>
-          <w:kern w:val="2"/>
-          <w:lang w:val="es-CO" w:eastAsia="es-CO"/>
-          <w14:ligatures w14:val="standardContextual"/>
-        </w:rPr>
-      </w:pPr>
-      <w:hyperlink w:anchor="_Toc228557407" w:history="1">
-        <w:r>
-          <w:rPr>
-            <w:rStyle w:val="Hipervnculo"/>
-            <w:noProof/>
-          </w:rPr>
-          <w:t>Objetivo</w:t>
-        </w:r>
-        <w:r>
-          <w:rPr>
-            <w:rStyle w:val="Hipervnculo"/>
-            <w:noProof/>
-            <w:spacing w:val="-5"/>
-          </w:rPr>
-          <w:t xml:space="preserve"> </w:t>
-        </w:r>
-        <w:r>
-          <w:rPr>
-            <w:rStyle w:val="Hipervnculo"/>
-            <w:noProof/>
-          </w:rPr>
-          <w:t>General</w:t>
-        </w:r>
-        <w:r>
-          <w:rPr>
-            <w:noProof/>
-            <w:webHidden/>
-          </w:rPr>
-          <w:tab/>
-        </w:r>
-        <w:r>
-          <w:rPr>
-            <w:noProof/>
-            <w:webHidden/>
-          </w:rPr>
-          <w:fldChar w:fldCharType="begin"/>
-        </w:r>
-        <w:r>
-          <w:rPr>
-            <w:noProof/>
-            <w:webHidden/>
-          </w:rPr>
-          <w:instrText xml:space="preserve"> PAGEREF _Toc228557407 \h </w:instrText>
-        </w:r>
-        <w:r>
-          <w:rPr>
-            <w:noProof/>
-            <w:webHidden/>
-          </w:rPr>
-        </w:r>
-        <w:r>
-          <w:rPr>
-            <w:noProof/>
-            <w:webHidden/>
-          </w:rPr>
-          <w:fldChar w:fldCharType="separate"/>
-        </w:r>
-        <w:r>
-          <w:rPr>
-            <w:noProof/>
-            <w:webHidden/>
-          </w:rPr>
-          <w:t>14</w:t>
-        </w:r>
-        <w:r>
-          <w:rPr>
-            <w:noProof/>
-            <w:webHidden/>
-          </w:rPr>
-          <w:fldChar w:fldCharType="end"/>
-        </w:r>
-      </w:hyperlink>
-    </w:p>
-    <w:p>
-      <w:pPr>
-        <w:pStyle w:val="TDC2"/>
-        <w:tabs>
-          <w:tab w:val="right" w:leader="dot" w:pos="9350"/>
-        </w:tabs>
-        <w:rPr>
-          <w:rFonts w:asciiTheme="minorHAnsi" w:eastAsiaTheme="minorEastAsia" w:hAnsiTheme="minorHAnsi" w:cstheme="minorBidi"/>
-          <w:noProof/>
-          <w:color w:val="auto"/>
-          <w:kern w:val="2"/>
-          <w:lang w:val="es-CO" w:eastAsia="es-CO"/>
-          <w14:ligatures w14:val="standardContextual"/>
-        </w:rPr>
-      </w:pPr>
-      <w:hyperlink w:anchor="_Toc228557408" w:history="1">
-        <w:r>
-          <w:rPr>
-            <w:rStyle w:val="Hipervnculo"/>
-            <w:noProof/>
-          </w:rPr>
-          <w:t>Objetivos</w:t>
-        </w:r>
-        <w:r>
-          <w:rPr>
-            <w:rStyle w:val="Hipervnculo"/>
-            <w:noProof/>
-            <w:spacing w:val="-3"/>
-          </w:rPr>
-          <w:t xml:space="preserve"> </w:t>
-        </w:r>
-        <w:r>
-          <w:rPr>
-            <w:rStyle w:val="Hipervnculo"/>
-            <w:noProof/>
-          </w:rPr>
-          <w:t>Específicos</w:t>
-        </w:r>
-        <w:r>
-          <w:rPr>
-            <w:noProof/>
-            <w:webHidden/>
-          </w:rPr>
-          <w:tab/>
-        </w:r>
-        <w:r>
-          <w:rPr>
-            <w:noProof/>
-            <w:webHidden/>
-          </w:rPr>
-          <w:fldChar w:fldCharType="begin"/>
-        </w:r>
-        <w:r>
-          <w:rPr>
-            <w:noProof/>
-            <w:webHidden/>
-          </w:rPr>
-          <w:instrText xml:space="preserve"> PAGEREF _Toc228557408 \h </w:instrText>
-        </w:r>
-        <w:r>
-          <w:rPr>
-            <w:noProof/>
-            <w:webHidden/>
-          </w:rPr>
-        </w:r>
-        <w:r>
-          <w:rPr>
-            <w:noProof/>
-            <w:webHidden/>
-          </w:rPr>
-          <w:fldChar w:fldCharType="separate"/>
-        </w:r>
-        <w:r>
-          <w:rPr>
-            <w:noProof/>
-            <w:webHidden/>
-          </w:rPr>
-          <w:t>14</w:t>
+          <w:t>6</w:t>
         </w:r>
         <w:r>
           <w:rPr>
@@ -984,17 +635,17 @@
           <w:noProof/>
           <w:color w:val="auto"/>
           <w:kern w:val="2"/>
-          <w:lang w:val="es-CO" w:eastAsia="es-CO"/>
+          <w:lang w:val="es-MX" w:eastAsia="es-MX"/>
           <w14:ligatures w14:val="standardContextual"/>
         </w:rPr>
       </w:pPr>
-      <w:hyperlink w:anchor="_Toc228557409" w:history="1">
+      <w:hyperlink w:anchor="_Toc229071767" w:history="1">
         <w:r>
           <w:rPr>
             <w:rStyle w:val="Hipervnculo"/>
             <w:noProof/>
           </w:rPr>
-          <w:t>Alcanze</w:t>
+          <w:t>Objetivos</w:t>
         </w:r>
         <w:r>
           <w:rPr>
@@ -1015,7 +666,7 @@
             <w:noProof/>
             <w:webHidden/>
           </w:rPr>
-          <w:instrText xml:space="preserve"> PAGEREF _Toc228557409 \h </w:instrText>
+          <w:instrText xml:space="preserve"> PAGEREF _Toc229071767 \h </w:instrText>
         </w:r>
         <w:r>
           <w:rPr>
@@ -1035,7 +686,7 @@
             <w:noProof/>
             <w:webHidden/>
           </w:rPr>
-          <w:t>15</w:t>
+          <w:t>7</w:t>
         </w:r>
         <w:r>
           <w:rPr>
@@ -1057,17 +708,32 @@
           <w:noProof/>
           <w:color w:val="auto"/>
           <w:kern w:val="2"/>
-          <w:lang w:val="es-CO" w:eastAsia="es-CO"/>
+          <w:lang w:val="es-MX" w:eastAsia="es-MX"/>
           <w14:ligatures w14:val="standardContextual"/>
         </w:rPr>
       </w:pPr>
-      <w:hyperlink w:anchor="_Toc228557410" w:history="1">
+      <w:hyperlink w:anchor="_Toc229071768" w:history="1">
         <w:r>
           <w:rPr>
             <w:rStyle w:val="Hipervnculo"/>
             <w:noProof/>
           </w:rPr>
-          <w:t>Alcance Funcional incluido</w:t>
+          <w:t>Objetivo</w:t>
+        </w:r>
+        <w:r>
+          <w:rPr>
+            <w:rStyle w:val="Hipervnculo"/>
+            <w:noProof/>
+            <w:spacing w:val="-5"/>
+          </w:rPr>
+          <w:t xml:space="preserve"> </w:t>
+        </w:r>
+        <w:r>
+          <w:rPr>
+            <w:rStyle w:val="Hipervnculo"/>
+            <w:noProof/>
+          </w:rPr>
+          <w:t>General</w:t>
         </w:r>
         <w:r>
           <w:rPr>
@@ -1088,7 +754,7 @@
             <w:noProof/>
             <w:webHidden/>
           </w:rPr>
-          <w:instrText xml:space="preserve"> PAGEREF _Toc228557410 \h </w:instrText>
+          <w:instrText xml:space="preserve"> PAGEREF _Toc229071768 \h </w:instrText>
         </w:r>
         <w:r>
           <w:rPr>
@@ -1108,7 +774,7 @@
             <w:noProof/>
             <w:webHidden/>
           </w:rPr>
-          <w:t>15</w:t>
+          <w:t>7</w:t>
         </w:r>
         <w:r>
           <w:rPr>
@@ -1130,17 +796,32 @@
           <w:noProof/>
           <w:color w:val="auto"/>
           <w:kern w:val="2"/>
-          <w:lang w:val="es-CO" w:eastAsia="es-CO"/>
+          <w:lang w:val="es-MX" w:eastAsia="es-MX"/>
           <w14:ligatures w14:val="standardContextual"/>
         </w:rPr>
       </w:pPr>
-      <w:hyperlink w:anchor="_Toc228557411" w:history="1">
+      <w:hyperlink w:anchor="_Toc229071769" w:history="1">
         <w:r>
           <w:rPr>
             <w:rStyle w:val="Hipervnculo"/>
             <w:noProof/>
           </w:rPr>
-          <w:t>Exclusiones del alcance</w:t>
+          <w:t>Objetivos</w:t>
+        </w:r>
+        <w:r>
+          <w:rPr>
+            <w:rStyle w:val="Hipervnculo"/>
+            <w:noProof/>
+            <w:spacing w:val="-3"/>
+          </w:rPr>
+          <w:t xml:space="preserve"> </w:t>
+        </w:r>
+        <w:r>
+          <w:rPr>
+            <w:rStyle w:val="Hipervnculo"/>
+            <w:noProof/>
+          </w:rPr>
+          <w:t>Específicos</w:t>
         </w:r>
         <w:r>
           <w:rPr>
@@ -1161,7 +842,7 @@
             <w:noProof/>
             <w:webHidden/>
           </w:rPr>
-          <w:instrText xml:space="preserve"> PAGEREF _Toc228557411 \h </w:instrText>
+          <w:instrText xml:space="preserve"> PAGEREF _Toc229071769 \h </w:instrText>
         </w:r>
         <w:r>
           <w:rPr>
@@ -1181,7 +862,7 @@
             <w:noProof/>
             <w:webHidden/>
           </w:rPr>
-          <w:t>16</w:t>
+          <w:t>7</w:t>
         </w:r>
         <w:r>
           <w:rPr>
@@ -1200,17 +881,17 @@
           <w:noProof/>
           <w:color w:val="auto"/>
           <w:kern w:val="2"/>
-          <w:lang w:val="es-CO" w:eastAsia="es-CO"/>
+          <w:lang w:val="es-MX" w:eastAsia="es-MX"/>
           <w14:ligatures w14:val="standardContextual"/>
         </w:rPr>
       </w:pPr>
-      <w:hyperlink w:anchor="_Toc228557412" w:history="1">
+      <w:hyperlink w:anchor="_Toc229071770" w:history="1">
         <w:r>
           <w:rPr>
             <w:rStyle w:val="Hipervnculo"/>
             <w:noProof/>
           </w:rPr>
-          <w:t>Título Primer Nivel</w:t>
+          <w:t>Alcance</w:t>
         </w:r>
         <w:r>
           <w:rPr>
@@ -1231,7 +912,7 @@
             <w:noProof/>
             <w:webHidden/>
           </w:rPr>
-          <w:instrText xml:space="preserve"> PAGEREF _Toc228557412 \h </w:instrText>
+          <w:instrText xml:space="preserve"> PAGEREF _Toc229071770 \h </w:instrText>
         </w:r>
         <w:r>
           <w:rPr>
@@ -1251,7 +932,7 @@
             <w:noProof/>
             <w:webHidden/>
           </w:rPr>
-          <w:t>17</w:t>
+          <w:t>8</w:t>
         </w:r>
         <w:r>
           <w:rPr>
@@ -1264,7 +945,7 @@
     </w:p>
     <w:p>
       <w:pPr>
-        <w:pStyle w:val="TDC2"/>
+        <w:pStyle w:val="TDC3"/>
         <w:tabs>
           <w:tab w:val="right" w:leader="dot" w:pos="9350"/>
         </w:tabs>
@@ -1273,17 +954,17 @@
           <w:noProof/>
           <w:color w:val="auto"/>
           <w:kern w:val="2"/>
-          <w:lang w:val="es-CO" w:eastAsia="es-CO"/>
+          <w:lang w:val="es-MX" w:eastAsia="es-MX"/>
           <w14:ligatures w14:val="standardContextual"/>
         </w:rPr>
       </w:pPr>
-      <w:hyperlink w:anchor="_Toc228557413" w:history="1">
+      <w:hyperlink w:anchor="_Toc229071771" w:history="1">
         <w:r>
           <w:rPr>
             <w:rStyle w:val="Hipervnculo"/>
             <w:noProof/>
           </w:rPr>
-          <w:t>Titulo de Segundo Nivel</w:t>
+          <w:t>Módulo 1 — Usuarios</w:t>
         </w:r>
         <w:r>
           <w:rPr>
@@ -1304,7 +985,7 @@
             <w:noProof/>
             <w:webHidden/>
           </w:rPr>
-          <w:instrText xml:space="preserve"> PAGEREF _Toc228557413 \h </w:instrText>
+          <w:instrText xml:space="preserve"> PAGEREF _Toc229071771 \h </w:instrText>
         </w:r>
         <w:r>
           <w:rPr>
@@ -1324,7 +1005,7 @@
             <w:noProof/>
             <w:webHidden/>
           </w:rPr>
-          <w:t>17</w:t>
+          <w:t>8</w:t>
         </w:r>
         <w:r>
           <w:rPr>
@@ -1346,18 +1027,17 @@
           <w:noProof/>
           <w:color w:val="auto"/>
           <w:kern w:val="2"/>
-          <w:lang w:val="es-CO" w:eastAsia="es-CO"/>
+          <w:lang w:val="es-MX" w:eastAsia="es-MX"/>
           <w14:ligatures w14:val="standardContextual"/>
         </w:rPr>
       </w:pPr>
-      <w:hyperlink w:anchor="_Toc228557414" w:history="1">
+      <w:hyperlink w:anchor="_Toc229071772" w:history="1">
         <w:r>
           <w:rPr>
             <w:rStyle w:val="Hipervnculo"/>
             <w:noProof/>
-            <w:lang w:val="es-ES"/>
-          </w:rPr>
-          <w:t>Ejemplo de Ubicación Viñetas</w:t>
+          </w:rPr>
+          <w:t>Módulo 2 — Productos</w:t>
         </w:r>
         <w:r>
           <w:rPr>
@@ -1378,7 +1058,7 @@
             <w:noProof/>
             <w:webHidden/>
           </w:rPr>
-          <w:instrText xml:space="preserve"> PAGEREF _Toc228557414 \h </w:instrText>
+          <w:instrText xml:space="preserve"> PAGEREF _Toc229071772 \h </w:instrText>
         </w:r>
         <w:r>
           <w:rPr>
@@ -1398,7 +1078,7 @@
             <w:noProof/>
             <w:webHidden/>
           </w:rPr>
-          <w:t>18</w:t>
+          <w:t>9</w:t>
         </w:r>
         <w:r>
           <w:rPr>
@@ -1420,17 +1100,17 @@
           <w:noProof/>
           <w:color w:val="auto"/>
           <w:kern w:val="2"/>
-          <w:lang w:val="es-CO" w:eastAsia="es-CO"/>
+          <w:lang w:val="es-MX" w:eastAsia="es-MX"/>
           <w14:ligatures w14:val="standardContextual"/>
         </w:rPr>
       </w:pPr>
-      <w:hyperlink w:anchor="_Toc228557415" w:history="1">
+      <w:hyperlink w:anchor="_Toc229071773" w:history="1">
         <w:r>
           <w:rPr>
             <w:rStyle w:val="Hipervnculo"/>
             <w:noProof/>
           </w:rPr>
-          <w:t>Titulo de Tercer Nivel</w:t>
+          <w:t>Módulo 3 — Carrito y órdenes</w:t>
         </w:r>
         <w:r>
           <w:rPr>
@@ -1451,7 +1131,7 @@
             <w:noProof/>
             <w:webHidden/>
           </w:rPr>
-          <w:instrText xml:space="preserve"> PAGEREF _Toc228557415 \h </w:instrText>
+          <w:instrText xml:space="preserve"> PAGEREF _Toc229071773 \h </w:instrText>
         </w:r>
         <w:r>
           <w:rPr>
@@ -1471,7 +1151,7 @@
             <w:noProof/>
             <w:webHidden/>
           </w:rPr>
-          <w:t>18</w:t>
+          <w:t>9</w:t>
         </w:r>
         <w:r>
           <w:rPr>
@@ -1484,27 +1164,26 @@
     </w:p>
     <w:p>
       <w:pPr>
-        <w:pStyle w:val="TDC4"/>
+        <w:pStyle w:val="TDC3"/>
         <w:tabs>
           <w:tab w:val="right" w:leader="dot" w:pos="9350"/>
         </w:tabs>
         <w:rPr>
-          <w:rFonts w:asciiTheme="minorHAnsi" w:eastAsiaTheme="minorEastAsia" w:hAnsiTheme="minorHAnsi"/>
+          <w:rFonts w:asciiTheme="minorHAnsi" w:eastAsiaTheme="minorEastAsia" w:hAnsiTheme="minorHAnsi" w:cstheme="minorBidi"/>
           <w:noProof/>
           <w:color w:val="auto"/>
           <w:kern w:val="2"/>
-          <w:szCs w:val="24"/>
-          <w:lang w:eastAsia="es-CO"/>
+          <w:lang w:val="es-MX" w:eastAsia="es-MX"/>
           <w14:ligatures w14:val="standardContextual"/>
         </w:rPr>
       </w:pPr>
-      <w:hyperlink w:anchor="_Toc228557416" w:history="1">
+      <w:hyperlink w:anchor="_Toc229071774" w:history="1">
         <w:r>
           <w:rPr>
             <w:rStyle w:val="Hipervnculo"/>
             <w:noProof/>
           </w:rPr>
-          <w:t>Titulo de Cuarto Nivel.</w:t>
+          <w:t>Módulo 4 — Pagos</w:t>
         </w:r>
         <w:r>
           <w:rPr>
@@ -1525,7 +1204,7 @@
             <w:noProof/>
             <w:webHidden/>
           </w:rPr>
-          <w:instrText xml:space="preserve"> PAGEREF _Toc228557416 \h </w:instrText>
+          <w:instrText xml:space="preserve"> PAGEREF _Toc229071774 \h </w:instrText>
         </w:r>
         <w:r>
           <w:rPr>
@@ -1545,7 +1224,7 @@
             <w:noProof/>
             <w:webHidden/>
           </w:rPr>
-          <w:t>18</w:t>
+          <w:t>9</w:t>
         </w:r>
         <w:r>
           <w:rPr>
@@ -1558,27 +1237,26 @@
     </w:p>
     <w:p>
       <w:pPr>
-        <w:pStyle w:val="TDC5"/>
+        <w:pStyle w:val="TDC3"/>
         <w:tabs>
           <w:tab w:val="right" w:leader="dot" w:pos="9350"/>
         </w:tabs>
         <w:rPr>
-          <w:rFonts w:asciiTheme="minorHAnsi" w:eastAsiaTheme="minorEastAsia" w:hAnsiTheme="minorHAnsi"/>
+          <w:rFonts w:asciiTheme="minorHAnsi" w:eastAsiaTheme="minorEastAsia" w:hAnsiTheme="minorHAnsi" w:cstheme="minorBidi"/>
           <w:noProof/>
           <w:color w:val="auto"/>
           <w:kern w:val="2"/>
-          <w:szCs w:val="24"/>
-          <w:lang w:eastAsia="es-CO"/>
+          <w:lang w:val="es-MX" w:eastAsia="es-MX"/>
           <w14:ligatures w14:val="standardContextual"/>
         </w:rPr>
       </w:pPr>
-      <w:hyperlink w:anchor="_Toc228557417" w:history="1">
+      <w:hyperlink w:anchor="_Toc229071775" w:history="1">
         <w:r>
           <w:rPr>
             <w:rStyle w:val="Hipervnculo"/>
             <w:noProof/>
           </w:rPr>
-          <w:t>Titulo de Cuarto Nivel.</w:t>
+          <w:t>Módulo 5 — Inventario</w:t>
         </w:r>
         <w:r>
           <w:rPr>
@@ -1599,7 +1277,7 @@
             <w:noProof/>
             <w:webHidden/>
           </w:rPr>
-          <w:instrText xml:space="preserve"> PAGEREF _Toc228557417 \h </w:instrText>
+          <w:instrText xml:space="preserve"> PAGEREF _Toc229071775 \h </w:instrText>
         </w:r>
         <w:r>
           <w:rPr>
@@ -1619,7 +1297,153 @@
             <w:noProof/>
             <w:webHidden/>
           </w:rPr>
-          <w:t>18</w:t>
+          <w:t>10</w:t>
+        </w:r>
+        <w:r>
+          <w:rPr>
+            <w:noProof/>
+            <w:webHidden/>
+          </w:rPr>
+          <w:fldChar w:fldCharType="end"/>
+        </w:r>
+      </w:hyperlink>
+    </w:p>
+    <w:p>
+      <w:pPr>
+        <w:pStyle w:val="TDC3"/>
+        <w:tabs>
+          <w:tab w:val="right" w:leader="dot" w:pos="9350"/>
+        </w:tabs>
+        <w:rPr>
+          <w:rFonts w:asciiTheme="minorHAnsi" w:eastAsiaTheme="minorEastAsia" w:hAnsiTheme="minorHAnsi" w:cstheme="minorBidi"/>
+          <w:noProof/>
+          <w:color w:val="auto"/>
+          <w:kern w:val="2"/>
+          <w:lang w:val="es-MX" w:eastAsia="es-MX"/>
+          <w14:ligatures w14:val="standardContextual"/>
+        </w:rPr>
+      </w:pPr>
+      <w:hyperlink w:anchor="_Toc229071776" w:history="1">
+        <w:r>
+          <w:rPr>
+            <w:rStyle w:val="Hipervnculo"/>
+            <w:noProof/>
+          </w:rPr>
+          <w:t>Módulo 6 — Domicilios</w:t>
+        </w:r>
+        <w:r>
+          <w:rPr>
+            <w:noProof/>
+            <w:webHidden/>
+          </w:rPr>
+          <w:tab/>
+        </w:r>
+        <w:r>
+          <w:rPr>
+            <w:noProof/>
+            <w:webHidden/>
+          </w:rPr>
+          <w:fldChar w:fldCharType="begin"/>
+        </w:r>
+        <w:r>
+          <w:rPr>
+            <w:noProof/>
+            <w:webHidden/>
+          </w:rPr>
+          <w:instrText xml:space="preserve"> PAGEREF _Toc229071776 \h </w:instrText>
+        </w:r>
+        <w:r>
+          <w:rPr>
+            <w:noProof/>
+            <w:webHidden/>
+          </w:rPr>
+        </w:r>
+        <w:r>
+          <w:rPr>
+            <w:noProof/>
+            <w:webHidden/>
+          </w:rPr>
+          <w:fldChar w:fldCharType="separate"/>
+        </w:r>
+        <w:r>
+          <w:rPr>
+            <w:noProof/>
+            <w:webHidden/>
+          </w:rPr>
+          <w:t>10</w:t>
+        </w:r>
+        <w:r>
+          <w:rPr>
+            <w:noProof/>
+            <w:webHidden/>
+          </w:rPr>
+          <w:fldChar w:fldCharType="end"/>
+        </w:r>
+      </w:hyperlink>
+    </w:p>
+    <w:p>
+      <w:pPr>
+        <w:pStyle w:val="TDC2"/>
+        <w:tabs>
+          <w:tab w:val="right" w:leader="dot" w:pos="9350"/>
+        </w:tabs>
+        <w:rPr>
+          <w:rFonts w:asciiTheme="minorHAnsi" w:eastAsiaTheme="minorEastAsia" w:hAnsiTheme="minorHAnsi" w:cstheme="minorBidi"/>
+          <w:noProof/>
+          <w:color w:val="auto"/>
+          <w:kern w:val="2"/>
+          <w:lang w:val="es-MX" w:eastAsia="es-MX"/>
+          <w14:ligatures w14:val="standardContextual"/>
+        </w:rPr>
+      </w:pPr>
+      <w:hyperlink w:anchor="_Toc229071777" w:history="1">
+        <w:r>
+          <w:rPr>
+            <w:rStyle w:val="Hipervnculo"/>
+            <w:noProof/>
+          </w:rPr>
+          <w:t>Exclusiones del alcance</w:t>
+        </w:r>
+        <w:r>
+          <w:rPr>
+            <w:noProof/>
+            <w:webHidden/>
+          </w:rPr>
+          <w:tab/>
+        </w:r>
+        <w:r>
+          <w:rPr>
+            <w:noProof/>
+            <w:webHidden/>
+          </w:rPr>
+          <w:fldChar w:fldCharType="begin"/>
+        </w:r>
+        <w:r>
+          <w:rPr>
+            <w:noProof/>
+            <w:webHidden/>
+          </w:rPr>
+          <w:instrText xml:space="preserve"> PAGEREF _Toc229071777 \h </w:instrText>
+        </w:r>
+        <w:r>
+          <w:rPr>
+            <w:noProof/>
+            <w:webHidden/>
+          </w:rPr>
+        </w:r>
+        <w:r>
+          <w:rPr>
+            <w:noProof/>
+            <w:webHidden/>
+          </w:rPr>
+          <w:fldChar w:fldCharType="separate"/>
+        </w:r>
+        <w:r>
+          <w:rPr>
+            <w:noProof/>
+            <w:webHidden/>
+          </w:rPr>
+          <w:t>11</w:t>
         </w:r>
         <w:r>
           <w:rPr>
@@ -1638,17 +1462,17 @@
           <w:noProof/>
           <w:color w:val="auto"/>
           <w:kern w:val="2"/>
-          <w:lang w:val="es-CO" w:eastAsia="es-CO"/>
+          <w:lang w:val="es-MX" w:eastAsia="es-MX"/>
           <w14:ligatures w14:val="standardContextual"/>
         </w:rPr>
       </w:pPr>
-      <w:hyperlink w:anchor="_Toc228557418" w:history="1">
+      <w:hyperlink w:anchor="_Toc229071778" w:history="1">
         <w:r>
           <w:rPr>
             <w:rStyle w:val="Hipervnculo"/>
             <w:noProof/>
           </w:rPr>
-          <w:t>Figuras</w:t>
+          <w:t>Stack Tecnológico</w:t>
         </w:r>
         <w:r>
           <w:rPr>
@@ -1669,7 +1493,7 @@
             <w:noProof/>
             <w:webHidden/>
           </w:rPr>
-          <w:instrText xml:space="preserve"> PAGEREF _Toc228557418 \h </w:instrText>
+          <w:instrText xml:space="preserve"> PAGEREF _Toc229071778 \h </w:instrText>
         </w:r>
         <w:r>
           <w:rPr>
@@ -1689,7 +1513,7 @@
             <w:noProof/>
             <w:webHidden/>
           </w:rPr>
-          <w:t>19</w:t>
+          <w:t>11</w:t>
         </w:r>
         <w:r>
           <w:rPr>
@@ -1702,23 +1526,26 @@
     </w:p>
     <w:p>
       <w:pPr>
-        <w:pStyle w:val="TDC1"/>
+        <w:pStyle w:val="TDC2"/>
+        <w:tabs>
+          <w:tab w:val="right" w:leader="dot" w:pos="9350"/>
+        </w:tabs>
         <w:rPr>
           <w:rFonts w:asciiTheme="minorHAnsi" w:eastAsiaTheme="minorEastAsia" w:hAnsiTheme="minorHAnsi" w:cstheme="minorBidi"/>
           <w:noProof/>
           <w:color w:val="auto"/>
           <w:kern w:val="2"/>
-          <w:lang w:val="es-CO" w:eastAsia="es-CO"/>
+          <w:lang w:val="es-MX" w:eastAsia="es-MX"/>
           <w14:ligatures w14:val="standardContextual"/>
         </w:rPr>
       </w:pPr>
-      <w:hyperlink w:anchor="_Toc228557419" w:history="1">
+      <w:hyperlink w:anchor="_Toc229071779" w:history="1">
         <w:r>
           <w:rPr>
             <w:rStyle w:val="Hipervnculo"/>
             <w:noProof/>
           </w:rPr>
-          <w:t>Tablas</w:t>
+          <w:t>Frontend</w:t>
         </w:r>
         <w:r>
           <w:rPr>
@@ -1739,7 +1566,7 @@
             <w:noProof/>
             <w:webHidden/>
           </w:rPr>
-          <w:instrText xml:space="preserve"> PAGEREF _Toc228557419 \h </w:instrText>
+          <w:instrText xml:space="preserve"> PAGEREF _Toc229071779 \h </w:instrText>
         </w:r>
         <w:r>
           <w:rPr>
@@ -1759,7 +1586,7 @@
             <w:noProof/>
             <w:webHidden/>
           </w:rPr>
-          <w:t>20</w:t>
+          <w:t>11</w:t>
         </w:r>
         <w:r>
           <w:rPr>
@@ -1772,23 +1599,26 @@
     </w:p>
     <w:p>
       <w:pPr>
-        <w:pStyle w:val="TDC1"/>
+        <w:pStyle w:val="TDC2"/>
+        <w:tabs>
+          <w:tab w:val="right" w:leader="dot" w:pos="9350"/>
+        </w:tabs>
         <w:rPr>
           <w:rFonts w:asciiTheme="minorHAnsi" w:eastAsiaTheme="minorEastAsia" w:hAnsiTheme="minorHAnsi" w:cstheme="minorBidi"/>
           <w:noProof/>
           <w:color w:val="auto"/>
           <w:kern w:val="2"/>
-          <w:lang w:val="es-CO" w:eastAsia="es-CO"/>
+          <w:lang w:val="es-MX" w:eastAsia="es-MX"/>
           <w14:ligatures w14:val="standardContextual"/>
         </w:rPr>
       </w:pPr>
-      <w:hyperlink w:anchor="_Toc228557420" w:history="1">
+      <w:hyperlink w:anchor="_Toc229071780" w:history="1">
         <w:r>
           <w:rPr>
             <w:rStyle w:val="Hipervnculo"/>
             <w:noProof/>
           </w:rPr>
-          <w:t>Conclusiones</w:t>
+          <w:t>Backend</w:t>
         </w:r>
         <w:r>
           <w:rPr>
@@ -1809,7 +1639,7 @@
             <w:noProof/>
             <w:webHidden/>
           </w:rPr>
-          <w:instrText xml:space="preserve"> PAGEREF _Toc228557420 \h </w:instrText>
+          <w:instrText xml:space="preserve"> PAGEREF _Toc229071780 \h </w:instrText>
         </w:r>
         <w:r>
           <w:rPr>
@@ -1829,7 +1659,7 @@
             <w:noProof/>
             <w:webHidden/>
           </w:rPr>
-          <w:t>21</w:t>
+          <w:t>11</w:t>
         </w:r>
         <w:r>
           <w:rPr>
@@ -1842,23 +1672,26 @@
     </w:p>
     <w:p>
       <w:pPr>
-        <w:pStyle w:val="TDC1"/>
+        <w:pStyle w:val="TDC2"/>
+        <w:tabs>
+          <w:tab w:val="right" w:leader="dot" w:pos="9350"/>
+        </w:tabs>
         <w:rPr>
           <w:rFonts w:asciiTheme="minorHAnsi" w:eastAsiaTheme="minorEastAsia" w:hAnsiTheme="minorHAnsi" w:cstheme="minorBidi"/>
           <w:noProof/>
           <w:color w:val="auto"/>
           <w:kern w:val="2"/>
-          <w:lang w:val="es-CO" w:eastAsia="es-CO"/>
+          <w:lang w:val="es-MX" w:eastAsia="es-MX"/>
           <w14:ligatures w14:val="standardContextual"/>
         </w:rPr>
       </w:pPr>
-      <w:hyperlink w:anchor="_Toc228557421" w:history="1">
+      <w:hyperlink w:anchor="_Toc229071781" w:history="1">
         <w:r>
           <w:rPr>
             <w:rStyle w:val="Hipervnculo"/>
             <w:noProof/>
           </w:rPr>
-          <w:t>Recomendaciones</w:t>
+          <w:t>Base de Datos</w:t>
         </w:r>
         <w:r>
           <w:rPr>
@@ -1879,7 +1712,7 @@
             <w:noProof/>
             <w:webHidden/>
           </w:rPr>
-          <w:instrText xml:space="preserve"> PAGEREF _Toc228557421 \h </w:instrText>
+          <w:instrText xml:space="preserve"> PAGEREF _Toc229071781 \h </w:instrText>
         </w:r>
         <w:r>
           <w:rPr>
@@ -1899,147 +1732,7 @@
             <w:noProof/>
             <w:webHidden/>
           </w:rPr>
-          <w:t>22</w:t>
-        </w:r>
-        <w:r>
-          <w:rPr>
-            <w:noProof/>
-            <w:webHidden/>
-          </w:rPr>
-          <w:fldChar w:fldCharType="end"/>
-        </w:r>
-      </w:hyperlink>
-    </w:p>
-    <w:p>
-      <w:pPr>
-        <w:pStyle w:val="TDC1"/>
-        <w:rPr>
-          <w:rFonts w:asciiTheme="minorHAnsi" w:eastAsiaTheme="minorEastAsia" w:hAnsiTheme="minorHAnsi" w:cstheme="minorBidi"/>
-          <w:noProof/>
-          <w:color w:val="auto"/>
-          <w:kern w:val="2"/>
-          <w:lang w:val="es-CO" w:eastAsia="es-CO"/>
-          <w14:ligatures w14:val="standardContextual"/>
-        </w:rPr>
-      </w:pPr>
-      <w:hyperlink w:anchor="_Toc228557422" w:history="1">
-        <w:r>
-          <w:rPr>
-            <w:rStyle w:val="Hipervnculo"/>
-            <w:noProof/>
-          </w:rPr>
-          <w:t>Referencias Bibliográficas</w:t>
-        </w:r>
-        <w:r>
-          <w:rPr>
-            <w:noProof/>
-            <w:webHidden/>
-          </w:rPr>
-          <w:tab/>
-        </w:r>
-        <w:r>
-          <w:rPr>
-            <w:noProof/>
-            <w:webHidden/>
-          </w:rPr>
-          <w:fldChar w:fldCharType="begin"/>
-        </w:r>
-        <w:r>
-          <w:rPr>
-            <w:noProof/>
-            <w:webHidden/>
-          </w:rPr>
-          <w:instrText xml:space="preserve"> PAGEREF _Toc228557422 \h </w:instrText>
-        </w:r>
-        <w:r>
-          <w:rPr>
-            <w:noProof/>
-            <w:webHidden/>
-          </w:rPr>
-        </w:r>
-        <w:r>
-          <w:rPr>
-            <w:noProof/>
-            <w:webHidden/>
-          </w:rPr>
-          <w:fldChar w:fldCharType="separate"/>
-        </w:r>
-        <w:r>
-          <w:rPr>
-            <w:noProof/>
-            <w:webHidden/>
-          </w:rPr>
-          <w:t>23</w:t>
-        </w:r>
-        <w:r>
-          <w:rPr>
-            <w:noProof/>
-            <w:webHidden/>
-          </w:rPr>
-          <w:fldChar w:fldCharType="end"/>
-        </w:r>
-      </w:hyperlink>
-    </w:p>
-    <w:p>
-      <w:pPr>
-        <w:pStyle w:val="TDC1"/>
-        <w:rPr>
-          <w:rFonts w:asciiTheme="minorHAnsi" w:eastAsiaTheme="minorEastAsia" w:hAnsiTheme="minorHAnsi" w:cstheme="minorBidi"/>
-          <w:noProof/>
-          <w:color w:val="auto"/>
-          <w:kern w:val="2"/>
-          <w:lang w:val="es-CO" w:eastAsia="es-CO"/>
-          <w14:ligatures w14:val="standardContextual"/>
-        </w:rPr>
-      </w:pPr>
-      <w:hyperlink w:anchor="_Toc228557423" w:history="1">
-        <w:r>
-          <w:rPr>
-            <w:rStyle w:val="Hipervnculo"/>
-            <w:noProof/>
-          </w:rPr>
-          <w:t>Apéndices</w:t>
-        </w:r>
-        <w:r>
-          <w:rPr>
-            <w:noProof/>
-            <w:webHidden/>
-          </w:rPr>
-          <w:tab/>
-        </w:r>
-        <w:r>
-          <w:rPr>
-            <w:noProof/>
-            <w:webHidden/>
-          </w:rPr>
-          <w:fldChar w:fldCharType="begin"/>
-        </w:r>
-        <w:r>
-          <w:rPr>
-            <w:noProof/>
-            <w:webHidden/>
-          </w:rPr>
-          <w:instrText xml:space="preserve"> PAGEREF _Toc228557423 \h </w:instrText>
-        </w:r>
-        <w:r>
-          <w:rPr>
-            <w:noProof/>
-            <w:webHidden/>
-          </w:rPr>
-        </w:r>
-        <w:r>
-          <w:rPr>
-            <w:noProof/>
-            <w:webHidden/>
-          </w:rPr>
-          <w:fldChar w:fldCharType="separate"/>
-        </w:r>
-        <w:r>
-          <w:rPr>
-            <w:noProof/>
-            <w:webHidden/>
-          </w:rPr>
-          <w:t>24</w:t>
+          <w:t>11</w:t>
         </w:r>
         <w:r>
           <w:rPr>
@@ -2062,690 +1755,14 @@
           <w:szCs w:val="24"/>
           <w:lang w:val="en-US"/>
         </w:rPr>
-        <w:lastRenderedPageBreak/>
         <w:fldChar w:fldCharType="end"/>
       </w:r>
     </w:p>
     <w:p>
       <w:pPr>
-        <w:rPr>
-          <w:lang w:val="en-US"/>
-        </w:rPr>
-      </w:pPr>
-    </w:p>
-    <w:p>
-      <w:pPr>
-        <w:rPr>
-          <w:lang w:val="en-US"/>
-        </w:rPr>
-      </w:pPr>
-    </w:p>
-    <w:p>
-      <w:pPr>
-        <w:rPr>
-          <w:lang w:val="en-US"/>
-        </w:rPr>
-      </w:pPr>
-    </w:p>
-    <w:p>
-      <w:pPr>
-        <w:rPr>
-          <w:lang w:val="en-US"/>
-        </w:rPr>
-      </w:pPr>
-    </w:p>
-    <w:p>
-      <w:pPr>
-        <w:pStyle w:val="Sinespaciado"/>
-        <w:jc w:val="center"/>
-        <w:rPr>
-          <w:b/>
-        </w:rPr>
-      </w:pPr>
-      <w:r>
-        <w:rPr>
-          <w:b/>
-        </w:rPr>
-        <w:t xml:space="preserve">Lista de </w:t>
-      </w:r>
-      <w:r>
-        <w:rPr>
-          <w:b/>
-        </w:rPr>
-        <w:t>F</w:t>
-      </w:r>
-      <w:r>
-        <w:rPr>
-          <w:b/>
-        </w:rPr>
-        <w:t>iguras</w:t>
-      </w:r>
-    </w:p>
-    <w:p>
-      <w:pPr>
-        <w:pStyle w:val="Tabladeilustraciones"/>
-        <w:tabs>
-          <w:tab w:val="right" w:leader="dot" w:pos="9350"/>
-        </w:tabs>
-        <w:rPr>
-          <w:rFonts w:asciiTheme="minorHAnsi" w:eastAsiaTheme="minorEastAsia" w:hAnsiTheme="minorHAnsi"/>
-          <w:noProof/>
-          <w:color w:val="auto"/>
-          <w:sz w:val="22"/>
-          <w:lang w:eastAsia="es-CO"/>
-        </w:rPr>
-      </w:pPr>
-      <w:r>
-        <w:fldChar w:fldCharType="begin"/>
-      </w:r>
-      <w:r>
-        <w:instrText xml:space="preserve"> TOC \h \z \c "Figura" </w:instrText>
-      </w:r>
-      <w:r>
-        <w:fldChar w:fldCharType="separate"/>
-      </w:r>
-      <w:hyperlink w:anchor="_Toc196843269" w:history="1">
-        <w:r>
-          <w:rPr>
-            <w:rStyle w:val="Hipervnculo"/>
-            <w:b/>
-            <w:noProof/>
-          </w:rPr>
-          <w:t>Figura 1</w:t>
-        </w:r>
-        <w:r>
-          <w:rPr>
-            <w:rStyle w:val="Hipervnculo"/>
-            <w:i/>
-            <w:noProof/>
-          </w:rPr>
-          <w:t xml:space="preserve"> Ejemplo de Figura con su Nota</w:t>
-        </w:r>
-        <w:r>
-          <w:rPr>
-            <w:noProof/>
-            <w:webHidden/>
-          </w:rPr>
-          <w:tab/>
-        </w:r>
-        <w:r>
-          <w:rPr>
-            <w:noProof/>
-            <w:webHidden/>
-          </w:rPr>
-          <w:fldChar w:fldCharType="begin"/>
-        </w:r>
-        <w:r>
-          <w:rPr>
-            <w:noProof/>
-            <w:webHidden/>
-          </w:rPr>
-          <w:instrText xml:space="preserve"> PAGEREF _Toc196843269 \h </w:instrText>
-        </w:r>
-        <w:r>
-          <w:rPr>
-            <w:noProof/>
-            <w:webHidden/>
-          </w:rPr>
-        </w:r>
-        <w:r>
-          <w:rPr>
-            <w:noProof/>
-            <w:webHidden/>
-          </w:rPr>
-          <w:fldChar w:fldCharType="separate"/>
-        </w:r>
-        <w:r>
-          <w:rPr>
-            <w:noProof/>
-            <w:webHidden/>
-          </w:rPr>
-          <w:t>16</w:t>
-        </w:r>
-        <w:r>
-          <w:rPr>
-            <w:noProof/>
-            <w:webHidden/>
-          </w:rPr>
-          <w:fldChar w:fldCharType="end"/>
-        </w:r>
-      </w:hyperlink>
-    </w:p>
-    <w:p>
-      <w:pPr>
-        <w:pStyle w:val="Sinespaciado"/>
-      </w:pPr>
-      <w:r>
-        <w:fldChar w:fldCharType="end"/>
-      </w:r>
-    </w:p>
-    <w:p>
-      <w:pPr>
-        <w:pStyle w:val="Sinespaciado"/>
-      </w:pPr>
-    </w:p>
-    <w:p>
-      <w:pPr>
-        <w:pStyle w:val="Sinespaciado"/>
-      </w:pPr>
-    </w:p>
-    <w:p>
-      <w:pPr>
-        <w:pStyle w:val="Sinespaciado"/>
-      </w:pPr>
-    </w:p>
-    <w:p>
-      <w:pPr>
-        <w:pStyle w:val="Sinespaciado"/>
-      </w:pPr>
-    </w:p>
-    <w:p>
-      <w:pPr>
-        <w:pStyle w:val="Sinespaciado"/>
-      </w:pPr>
-    </w:p>
-    <w:p>
-      <w:pPr>
-        <w:pStyle w:val="Sinespaciado"/>
-      </w:pPr>
-    </w:p>
-    <w:p>
-      <w:pPr>
-        <w:pStyle w:val="Sinespaciado"/>
-      </w:pPr>
-    </w:p>
-    <w:p>
-      <w:pPr>
-        <w:pStyle w:val="Sinespaciado"/>
-      </w:pPr>
-    </w:p>
-    <w:p>
-      <w:pPr>
-        <w:pStyle w:val="Sinespaciado"/>
-      </w:pPr>
-    </w:p>
-    <w:p>
-      <w:pPr>
-        <w:pStyle w:val="Sinespaciado"/>
-      </w:pPr>
-    </w:p>
-    <w:p>
-      <w:pPr>
-        <w:pStyle w:val="Sinespaciado"/>
-      </w:pPr>
-    </w:p>
-    <w:p>
-      <w:pPr>
-        <w:pStyle w:val="Sinespaciado"/>
-      </w:pPr>
-    </w:p>
-    <w:p>
-      <w:pPr>
-        <w:pStyle w:val="Sinespaciado"/>
-      </w:pPr>
-    </w:p>
-    <w:p>
-      <w:pPr>
-        <w:pStyle w:val="Sinespaciado"/>
-      </w:pPr>
-    </w:p>
-    <w:p>
-      <w:pPr>
-        <w:pStyle w:val="Sinespaciado"/>
-      </w:pPr>
-    </w:p>
-    <w:p>
-      <w:pPr>
-        <w:pStyle w:val="Sinespaciado"/>
-      </w:pPr>
-    </w:p>
-    <w:p>
-      <w:pPr>
-        <w:pStyle w:val="Sinespaciado"/>
-      </w:pPr>
-    </w:p>
-    <w:p>
-      <w:pPr>
-        <w:pStyle w:val="Sinespaciado"/>
-      </w:pPr>
-    </w:p>
-    <w:p>
-      <w:pPr>
-        <w:pStyle w:val="Sinespaciado"/>
-      </w:pPr>
-    </w:p>
-    <w:p>
-      <w:pPr>
-        <w:pStyle w:val="Sinespaciado"/>
-      </w:pPr>
-    </w:p>
-    <w:p>
-      <w:pPr>
-        <w:pStyle w:val="Sinespaciado"/>
-        <w:jc w:val="center"/>
-        <w:rPr>
-          <w:rFonts w:cs="Times New Roman"/>
-          <w:szCs w:val="24"/>
-        </w:rPr>
-      </w:pPr>
-      <w:r>
-        <w:rPr>
-          <w:b/>
-        </w:rPr>
-        <w:t>Lista de Tablas</w:t>
-      </w:r>
-    </w:p>
-    <w:p>
-      <w:pPr>
-        <w:pStyle w:val="Tabladeilustraciones"/>
-        <w:tabs>
-          <w:tab w:val="right" w:leader="dot" w:pos="9350"/>
-        </w:tabs>
-        <w:rPr>
-          <w:rFonts w:asciiTheme="minorHAnsi" w:eastAsiaTheme="minorEastAsia" w:hAnsiTheme="minorHAnsi"/>
-          <w:noProof/>
-          <w:color w:val="auto"/>
-          <w:sz w:val="22"/>
-          <w:lang w:eastAsia="es-CO"/>
-        </w:rPr>
-      </w:pPr>
-      <w:r>
-        <w:fldChar w:fldCharType="begin"/>
-      </w:r>
-      <w:r>
-        <w:instrText xml:space="preserve"> TOC \h \z \c "Tabla" </w:instrText>
-      </w:r>
-      <w:r>
-        <w:fldChar w:fldCharType="separate"/>
-      </w:r>
-      <w:hyperlink w:anchor="_Toc196843276" w:history="1">
-        <w:r>
-          <w:rPr>
-            <w:rStyle w:val="Hipervnculo"/>
-            <w:b/>
-            <w:noProof/>
-          </w:rPr>
-          <w:t>Tabla 1</w:t>
-        </w:r>
-        <w:r>
-          <w:rPr>
-            <w:rStyle w:val="Hipervnculo"/>
-            <w:i/>
-            <w:noProof/>
-          </w:rPr>
-          <w:t xml:space="preserve"> El Título Debe ser Breve y Descriptivo (en Cursiva)</w:t>
-        </w:r>
-        <w:r>
-          <w:rPr>
-            <w:noProof/>
-            <w:webHidden/>
-          </w:rPr>
-          <w:tab/>
-        </w:r>
-        <w:r>
-          <w:rPr>
-            <w:noProof/>
-            <w:webHidden/>
-          </w:rPr>
-          <w:fldChar w:fldCharType="begin"/>
-        </w:r>
-        <w:r>
-          <w:rPr>
-            <w:noProof/>
-            <w:webHidden/>
-          </w:rPr>
-          <w:instrText xml:space="preserve"> PAGEREF _Toc196843276 \h </w:instrText>
-        </w:r>
-        <w:r>
-          <w:rPr>
-            <w:noProof/>
-            <w:webHidden/>
-          </w:rPr>
-        </w:r>
-        <w:r>
-          <w:rPr>
-            <w:noProof/>
-            <w:webHidden/>
-          </w:rPr>
-          <w:fldChar w:fldCharType="separate"/>
-        </w:r>
-        <w:r>
-          <w:rPr>
-            <w:noProof/>
-            <w:webHidden/>
-          </w:rPr>
-          <w:t>17</w:t>
-        </w:r>
-        <w:r>
-          <w:rPr>
-            <w:noProof/>
-            <w:webHidden/>
-          </w:rPr>
-          <w:fldChar w:fldCharType="end"/>
-        </w:r>
-      </w:hyperlink>
-    </w:p>
-    <w:p>
-      <w:pPr>
-        <w:pStyle w:val="Sinespaciado"/>
-      </w:pPr>
-      <w:r>
-        <w:fldChar w:fldCharType="end"/>
-      </w:r>
-    </w:p>
-    <w:p>
-      <w:pPr>
-        <w:pStyle w:val="Sinespaciado"/>
-      </w:pPr>
-    </w:p>
-    <w:p>
-      <w:pPr>
-        <w:pStyle w:val="Sinespaciado"/>
-      </w:pPr>
-    </w:p>
-    <w:p>
-      <w:pPr>
-        <w:pStyle w:val="Sinespaciado"/>
-      </w:pPr>
-    </w:p>
-    <w:p>
-      <w:pPr>
-        <w:pStyle w:val="Sinespaciado"/>
-      </w:pPr>
-    </w:p>
-    <w:p>
-      <w:pPr>
-        <w:pStyle w:val="Sinespaciado"/>
-      </w:pPr>
-    </w:p>
-    <w:p>
-      <w:pPr>
-        <w:pStyle w:val="Sinespaciado"/>
-      </w:pPr>
-    </w:p>
-    <w:p>
-      <w:pPr>
-        <w:pStyle w:val="Sinespaciado"/>
-      </w:pPr>
-    </w:p>
-    <w:p>
-      <w:pPr>
-        <w:pStyle w:val="Sinespaciado"/>
-      </w:pPr>
-    </w:p>
-    <w:p>
-      <w:pPr>
-        <w:pStyle w:val="Sinespaciado"/>
-      </w:pPr>
-    </w:p>
-    <w:p>
-      <w:pPr>
-        <w:pStyle w:val="Sinespaciado"/>
-      </w:pPr>
-    </w:p>
-    <w:p>
-      <w:pPr>
-        <w:pStyle w:val="Sinespaciado"/>
-      </w:pPr>
-    </w:p>
-    <w:p>
-      <w:pPr>
-        <w:pStyle w:val="Sinespaciado"/>
-      </w:pPr>
-    </w:p>
-    <w:p>
-      <w:pPr>
-        <w:pStyle w:val="Sinespaciado"/>
-      </w:pPr>
-    </w:p>
-    <w:p>
-      <w:pPr>
-        <w:pStyle w:val="Sinespaciado"/>
-      </w:pPr>
-    </w:p>
-    <w:p>
-      <w:pPr>
-        <w:pStyle w:val="Sinespaciado"/>
-      </w:pPr>
-    </w:p>
-    <w:p>
-      <w:pPr>
-        <w:pStyle w:val="Sinespaciado"/>
-        <w:jc w:val="center"/>
-        <w:rPr>
-          <w:b/>
-        </w:rPr>
-      </w:pPr>
-      <w:r>
-        <w:rPr>
-          <w:b/>
-        </w:rPr>
-        <w:lastRenderedPageBreak/>
-        <w:t>Lista de Apéndices</w:t>
-      </w:r>
-    </w:p>
-    <w:p>
-      <w:pPr>
-        <w:pStyle w:val="Tabladeilustraciones"/>
-        <w:tabs>
-          <w:tab w:val="right" w:leader="dot" w:pos="9350"/>
-        </w:tabs>
-        <w:rPr>
-          <w:rFonts w:asciiTheme="minorHAnsi" w:eastAsiaTheme="minorEastAsia" w:hAnsiTheme="minorHAnsi"/>
-          <w:noProof/>
-          <w:color w:val="auto"/>
-          <w:sz w:val="22"/>
-          <w:lang w:eastAsia="es-CO"/>
-        </w:rPr>
-      </w:pPr>
-      <w:r>
-        <w:fldChar w:fldCharType="begin"/>
-      </w:r>
-      <w:r>
-        <w:instrText xml:space="preserve"> TOC \h \z \c "Apéndice" </w:instrText>
-      </w:r>
-      <w:r>
-        <w:fldChar w:fldCharType="separate"/>
-      </w:r>
-      <w:hyperlink w:anchor="_Toc196843282" w:history="1">
-        <w:r>
-          <w:rPr>
-            <w:rStyle w:val="Hipervnculo"/>
-            <w:b/>
-            <w:noProof/>
-          </w:rPr>
-          <w:t xml:space="preserve">Apéndice A </w:t>
-        </w:r>
-        <w:r>
-          <w:rPr>
-            <w:rStyle w:val="Hipervnculo"/>
-            <w:i/>
-            <w:noProof/>
-          </w:rPr>
-          <w:t>Ejemplo de Apéndice</w:t>
-        </w:r>
-        <w:r>
-          <w:rPr>
-            <w:noProof/>
-            <w:webHidden/>
-          </w:rPr>
-          <w:tab/>
-        </w:r>
-        <w:r>
-          <w:rPr>
-            <w:noProof/>
-            <w:webHidden/>
-          </w:rPr>
-          <w:fldChar w:fldCharType="begin"/>
-        </w:r>
-        <w:r>
-          <w:rPr>
-            <w:noProof/>
-            <w:webHidden/>
-          </w:rPr>
-          <w:instrText xml:space="preserve"> PAGEREF _Toc196843282 \h </w:instrText>
-        </w:r>
-        <w:r>
-          <w:rPr>
-            <w:noProof/>
-            <w:webHidden/>
-          </w:rPr>
-        </w:r>
-        <w:r>
-          <w:rPr>
-            <w:noProof/>
-            <w:webHidden/>
-          </w:rPr>
-          <w:fldChar w:fldCharType="separate"/>
-        </w:r>
-        <w:r>
-          <w:rPr>
-            <w:noProof/>
-            <w:webHidden/>
-          </w:rPr>
-          <w:t>21</w:t>
-        </w:r>
-        <w:r>
-          <w:rPr>
-            <w:noProof/>
-            <w:webHidden/>
-          </w:rPr>
-          <w:fldChar w:fldCharType="end"/>
-        </w:r>
-      </w:hyperlink>
-    </w:p>
-    <w:p>
-      <w:pPr>
-        <w:pStyle w:val="Sinespaciado"/>
-      </w:pPr>
-      <w:r>
-        <w:fldChar w:fldCharType="end"/>
-      </w:r>
-    </w:p>
-    <w:p/>
-    <w:p/>
-    <w:p/>
-    <w:p/>
-    <w:p/>
-    <w:p/>
-    <w:p/>
-    <w:p>
-      <w:pPr>
-        <w:rPr>
-          <w:lang w:val="es-ES"/>
-        </w:rPr>
-      </w:pPr>
-    </w:p>
-    <w:p>
-      <w:pPr>
-        <w:rPr>
-          <w:lang w:val="es-ES"/>
-        </w:rPr>
-      </w:pPr>
-    </w:p>
-    <w:p>
-      <w:pPr>
-        <w:rPr>
-          <w:lang w:val="es-ES"/>
-        </w:rPr>
-      </w:pPr>
-    </w:p>
-    <w:p/>
-    <w:p>
-      <w:pPr>
-        <w:ind w:firstLine="0"/>
-        <w:rPr>
-          <w:rFonts w:cs="Times New Roman"/>
-          <w:szCs w:val="24"/>
-          <w:lang w:val="es-ES"/>
-        </w:rPr>
-      </w:pPr>
-    </w:p>
-    <w:p>
-      <w:pPr>
-        <w:ind w:firstLine="0"/>
-        <w:rPr>
-          <w:rFonts w:cs="Times New Roman"/>
-          <w:szCs w:val="24"/>
-          <w:lang w:val="es-ES"/>
-        </w:rPr>
-      </w:pPr>
-    </w:p>
-    <w:p>
-      <w:pPr>
-        <w:ind w:firstLine="0"/>
-        <w:rPr>
-          <w:rFonts w:cs="Times New Roman"/>
-          <w:szCs w:val="24"/>
-          <w:lang w:val="es-ES"/>
-        </w:rPr>
-      </w:pPr>
-    </w:p>
-    <w:p>
-      <w:pPr>
-        <w:ind w:firstLine="0"/>
-        <w:rPr>
-          <w:rFonts w:cs="Times New Roman"/>
-          <w:szCs w:val="24"/>
-          <w:lang w:val="es-ES"/>
-        </w:rPr>
-      </w:pPr>
-    </w:p>
-    <w:p>
-      <w:pPr>
-        <w:ind w:firstLine="0"/>
-        <w:rPr>
-          <w:rFonts w:cs="Times New Roman"/>
-          <w:szCs w:val="24"/>
-          <w:lang w:val="es-ES"/>
-        </w:rPr>
-      </w:pPr>
-    </w:p>
-    <w:p>
-      <w:pPr>
-        <w:ind w:firstLine="0"/>
-        <w:rPr>
-          <w:rFonts w:cs="Times New Roman"/>
-          <w:szCs w:val="24"/>
-          <w:lang w:val="es-ES"/>
-        </w:rPr>
-      </w:pPr>
-    </w:p>
-    <w:p>
-      <w:pPr>
-        <w:ind w:firstLine="0"/>
-        <w:rPr>
-          <w:rFonts w:cs="Times New Roman"/>
-          <w:szCs w:val="24"/>
-          <w:lang w:val="es-ES"/>
-        </w:rPr>
-      </w:pPr>
-    </w:p>
-    <w:p>
-      <w:pPr>
-        <w:ind w:firstLine="0"/>
-        <w:rPr>
-          <w:rFonts w:cs="Times New Roman"/>
-          <w:szCs w:val="24"/>
-          <w:lang w:val="es-ES"/>
-        </w:rPr>
-      </w:pPr>
-    </w:p>
-    <w:p>
-      <w:pPr>
-        <w:ind w:firstLine="0"/>
-        <w:rPr>
-          <w:rFonts w:cs="Times New Roman"/>
-          <w:szCs w:val="24"/>
-          <w:lang w:val="es-ES"/>
-        </w:rPr>
-      </w:pPr>
-    </w:p>
-    <w:p>
-      <w:pPr>
         <w:pStyle w:val="Ttulo1"/>
       </w:pPr>
-      <w:bookmarkStart w:id="0" w:name="_Toc228557402"/>
+      <w:bookmarkStart w:id="0" w:name="_Toc229071761"/>
       <w:r>
         <w:lastRenderedPageBreak/>
         <w:t>Introducción</w:t>
@@ -2797,23 +1814,7 @@
           <w:rFonts w:cs="Times New Roman"/>
           <w:szCs w:val="24"/>
         </w:rPr>
-        <w:t xml:space="preserve">El presente proyecto, desarrollado en el marco del programa de Tecnología en Análisis y Desarrollo de Software del Servicio Nacional de Aprendizaje, tiene como propósito el diseño e implementación de una plataforma web denominada </w:t>
-      </w:r>
-      <w:proofErr w:type="spellStart"/>
-      <w:r>
-        <w:rPr>
-          <w:rFonts w:cs="Times New Roman"/>
-          <w:szCs w:val="24"/>
-        </w:rPr>
-        <w:t>FarmaTech</w:t>
-      </w:r>
-      <w:proofErr w:type="spellEnd"/>
-      <w:r>
-        <w:rPr>
-          <w:rFonts w:cs="Times New Roman"/>
-          <w:szCs w:val="24"/>
-        </w:rPr>
-        <w:t xml:space="preserve">, orientada a la gestión de inventario y la comercialización de productos a través de una tienda virtual. </w:t>
+        <w:t xml:space="preserve">El presente proyecto, desarrollado en el marco del programa de Tecnología en Análisis y Desarrollo de Software del Servicio Nacional de Aprendizaje, tiene como propósito el diseño e implementación de una plataforma web denominada FarmaTech, orientada a la gestión de inventario y la comercialización de productos a través de una tienda virtual. </w:t>
       </w:r>
     </w:p>
     <w:p>
@@ -2879,23 +1880,16 @@
     </w:p>
     <w:p>
       <w:pPr>
-        <w:ind w:firstLine="709"/>
-        <w:rPr>
-          <w:rFonts w:cs="Times New Roman"/>
-          <w:szCs w:val="24"/>
-        </w:rPr>
-      </w:pPr>
-    </w:p>
-    <w:p>
-      <w:pPr>
         <w:pStyle w:val="Ttulo1"/>
       </w:pPr>
-      <w:r>
+      <w:bookmarkStart w:id="1" w:name="_Toc229071762"/>
+      <w:r>
+        <w:lastRenderedPageBreak/>
         <w:t>Nombre Técnico</w:t>
       </w:r>
-    </w:p>
-    <w:p>
-      <w:bookmarkStart w:id="1" w:name="_Toc228557403"/>
+      <w:bookmarkEnd w:id="1"/>
+    </w:p>
+    <w:p>
       <w:r>
         <w:t>Desarrollo de un Sistema de Información para la Gestión de Inventario y Ventas en la Droguería Remanso.</w:t>
       </w:r>
@@ -2904,37 +1898,32 @@
       <w:pPr>
         <w:pStyle w:val="Ttulo2"/>
       </w:pPr>
+      <w:bookmarkStart w:id="2" w:name="_Toc229071763"/>
       <w:r>
         <w:t xml:space="preserve">Nombre </w:t>
       </w:r>
       <w:r>
         <w:t>Comercial</w:t>
       </w:r>
-    </w:p>
-    <w:p>
-      <w:r>
-        <w:t xml:space="preserve"> </w:t>
-      </w:r>
-      <w:r>
-        <w:t> </w:t>
-      </w:r>
-      <w:proofErr w:type="spellStart"/>
-      <w:r>
-        <w:t>FarmaTech</w:t>
-      </w:r>
-      <w:proofErr w:type="spellEnd"/>
+      <w:bookmarkEnd w:id="2"/>
+    </w:p>
+    <w:p>
+      <w:r>
+        <w:t xml:space="preserve">  FarmaTech</w:t>
+      </w:r>
     </w:p>
     <w:p>
       <w:pPr>
         <w:pStyle w:val="Ttulo1"/>
       </w:pPr>
+      <w:bookmarkStart w:id="3" w:name="_Toc229071764"/>
       <w:r>
         <w:t>Planteamiento</w:t>
       </w:r>
       <w:r>
         <w:t xml:space="preserve"> del Problema</w:t>
       </w:r>
-      <w:bookmarkEnd w:id="1"/>
+      <w:bookmarkEnd w:id="3"/>
     </w:p>
     <w:p>
       <w:r>
@@ -2991,11 +1980,14 @@
     </w:p>
     <w:p>
       <w:r>
+        <w:t xml:space="preserve">Pérdida de competitividad frente a grandes cadenas </w:t>
+      </w:r>
+      <w:r>
+        <w:t xml:space="preserve">Las grandes cadenas de farmacias cuentan con plataformas digitales que integran inventario en tiempo real, ventas en línea y </w:t>
+      </w:r>
+      <w:r>
         <w:lastRenderedPageBreak/>
-        <w:t xml:space="preserve">Pérdida de competitividad frente a grandes cadenas </w:t>
-      </w:r>
-      <w:r>
-        <w:t>Las grandes cadenas de farmacias cuentan con plataformas digitales que integran inventario en tiempo real, ventas en línea y atención al cliente multicanal. La ausencia de una solución tecnológica equivalente en Remansó la posiciona en clara desventaja competitiva en un mercado que avanza hacia la transformación digital.</w:t>
+        <w:t>atención al cliente multicanal. La ausencia de una solución tecnológica equivalente en Remansó la posiciona en clara desventaja competitiva en un mercado que avanza hacia la transformación digital.</w:t>
       </w:r>
     </w:p>
     <w:p>
@@ -3014,11 +2006,11 @@
       <w:pPr>
         <w:pStyle w:val="Ttulo1"/>
       </w:pPr>
-      <w:bookmarkStart w:id="2" w:name="_Toc228557404"/>
+      <w:bookmarkStart w:id="4" w:name="_Toc229071765"/>
       <w:r>
         <w:t>Pregunta del Proyecto</w:t>
       </w:r>
-      <w:bookmarkEnd w:id="2"/>
+      <w:bookmarkEnd w:id="4"/>
     </w:p>
     <w:p>
       <w:pPr>
@@ -3141,51 +2133,14 @@
     </w:p>
     <w:p>
       <w:pPr>
-        <w:ind w:firstLine="0"/>
-        <w:rPr>
-          <w:lang w:val="es-ES"/>
-        </w:rPr>
-      </w:pPr>
-    </w:p>
-    <w:p>
-      <w:pPr>
-        <w:ind w:firstLine="0"/>
-        <w:rPr>
-          <w:lang w:val="es-ES"/>
-        </w:rPr>
-      </w:pPr>
-    </w:p>
-    <w:p>
-      <w:pPr>
-        <w:ind w:firstLine="0"/>
-        <w:rPr>
-          <w:lang w:val="es-ES"/>
-        </w:rPr>
-      </w:pPr>
-    </w:p>
-    <w:p>
-      <w:pPr>
-        <w:ind w:firstLine="0"/>
-        <w:rPr>
-          <w:lang w:val="es-ES"/>
-        </w:rPr>
-      </w:pPr>
-    </w:p>
-    <w:p>
-      <w:pPr>
-        <w:ind w:firstLine="0"/>
-        <w:rPr>
-          <w:lang w:val="es-ES"/>
-        </w:rPr>
-      </w:pPr>
-    </w:p>
-    <w:p>
-      <w:pPr>
         <w:pStyle w:val="Ttulo1"/>
       </w:pPr>
-      <w:r>
+      <w:bookmarkStart w:id="5" w:name="_Toc229071766"/>
+      <w:r>
+        <w:lastRenderedPageBreak/>
         <w:t>Justificación</w:t>
       </w:r>
+      <w:bookmarkEnd w:id="5"/>
     </w:p>
     <w:p>
       <w:r>
@@ -3194,15 +2149,7 @@
     </w:p>
     <w:p>
       <w:r>
-        <w:t xml:space="preserve">El desarrollo de Remanso </w:t>
-      </w:r>
-      <w:proofErr w:type="spellStart"/>
-      <w:r>
-        <w:t>FarmaTech</w:t>
-      </w:r>
-      <w:proofErr w:type="spellEnd"/>
-      <w:r>
-        <w:t xml:space="preserve"> responde a esta realidad con una solución </w:t>
+        <w:t xml:space="preserve">El desarrollo de Remanso FarmaTech responde a esta realidad con una solución </w:t>
       </w:r>
       <w:r>
         <w:rPr>
@@ -3216,7 +2163,6 @@
       </w:r>
     </w:p>
     <w:p>
-      <w:proofErr w:type="gramStart"/>
       <w:r>
         <w:t>E</w:t>
       </w:r>
@@ -3230,11 +2176,7 @@
         <w:t xml:space="preserve"> </w:t>
       </w:r>
       <w:r>
-        <w:t>a desarrollar</w:t>
-      </w:r>
-      <w:proofErr w:type="gramEnd"/>
-      <w:r>
-        <w:t xml:space="preserve"> </w:t>
+        <w:t xml:space="preserve">a desarrollar </w:t>
       </w:r>
       <w:r>
         <w:t>genera valor en tres frentes: primero, en la eficiencia operativa, al centralizar la información de productos, inventario y ventas en un único sistema; segundo, en la experiencia del cliente, al ofrecer consulta de productos, compra en línea y seguimiento de pedidos; y tercero, en la toma de decisiones, al proveer al propietario información oportuna sobre el comportamiento del inventario y las ventas.</w:t>
@@ -3242,7 +2184,6 @@
     </w:p>
     <w:p>
       <w:r>
-        <w:lastRenderedPageBreak/>
         <w:t>En un entorno donde las grandes cadenas de farmacias ya operan con plataformas tecnológicas consolidadas, contar con un sistema propio representa para Remansó un paso concreto hacia su sostenibilidad y competitividad en el mercado local.</w:t>
       </w:r>
     </w:p>
@@ -3293,19 +2234,20 @@
       <w:pPr>
         <w:pStyle w:val="Ttulo1"/>
       </w:pPr>
-      <w:bookmarkStart w:id="3" w:name="_Toc228557406"/>
-      <w:r>
+      <w:bookmarkStart w:id="6" w:name="_Toc229071767"/>
+      <w:r>
+        <w:lastRenderedPageBreak/>
         <w:t>Objetivos</w:t>
       </w:r>
-      <w:bookmarkEnd w:id="3"/>
+      <w:bookmarkEnd w:id="6"/>
     </w:p>
     <w:p>
       <w:pPr>
         <w:pStyle w:val="Ttulo2"/>
       </w:pPr>
-      <w:bookmarkStart w:id="4" w:name="_bookmark15"/>
-      <w:bookmarkStart w:id="5" w:name="_Toc228557407"/>
-      <w:bookmarkEnd w:id="4"/>
+      <w:bookmarkStart w:id="7" w:name="_bookmark15"/>
+      <w:bookmarkStart w:id="8" w:name="_Toc229071768"/>
+      <w:bookmarkEnd w:id="7"/>
       <w:r>
         <w:t>Objetivo</w:t>
       </w:r>
@@ -3318,17 +2260,15 @@
       <w:r>
         <w:t>General</w:t>
       </w:r>
-      <w:bookmarkEnd w:id="5"/>
+      <w:bookmarkEnd w:id="8"/>
     </w:p>
     <w:p>
       <w:r>
         <w:t xml:space="preserve">Desarrollar el sistema de información web denominado </w:t>
       </w:r>
-      <w:proofErr w:type="spellStart"/>
       <w:r>
         <w:t>FarmaTech</w:t>
       </w:r>
-      <w:proofErr w:type="spellEnd"/>
       <w:r>
         <w:t xml:space="preserve"> que sirva como apoyo a la gestión de inventario y ventas de la </w:t>
       </w:r>
@@ -3349,9 +2289,9 @@
       <w:pPr>
         <w:pStyle w:val="Ttulo2"/>
       </w:pPr>
-      <w:bookmarkStart w:id="6" w:name="_bookmark16"/>
-      <w:bookmarkStart w:id="7" w:name="_Toc228557408"/>
-      <w:bookmarkEnd w:id="6"/>
+      <w:bookmarkStart w:id="9" w:name="_bookmark16"/>
+      <w:bookmarkStart w:id="10" w:name="_Toc229071769"/>
+      <w:bookmarkEnd w:id="9"/>
       <w:r>
         <w:t>Objetivos</w:t>
       </w:r>
@@ -3364,7 +2304,7 @@
       <w:r>
         <w:t>Específicos</w:t>
       </w:r>
-      <w:bookmarkEnd w:id="7"/>
+      <w:bookmarkEnd w:id="10"/>
     </w:p>
     <w:p>
       <w:r>
@@ -3479,9 +2419,12 @@
       <w:pPr>
         <w:pStyle w:val="Ttulo1"/>
       </w:pPr>
-      <w:r>
+      <w:bookmarkStart w:id="11" w:name="_Toc229071770"/>
+      <w:r>
+        <w:lastRenderedPageBreak/>
         <w:t>Alcance</w:t>
       </w:r>
+      <w:bookmarkEnd w:id="11"/>
     </w:p>
     <w:p>
       <w:r>
@@ -3495,7 +2438,6 @@
     </w:p>
     <w:p>
       <w:r>
-        <w:lastRenderedPageBreak/>
         <w:t>El sistema incluirá los siguientes módulos y funcionalidades:</w:t>
       </w:r>
     </w:p>
@@ -3503,9 +2445,11 @@
       <w:pPr>
         <w:pStyle w:val="Ttulo3"/>
       </w:pPr>
+      <w:bookmarkStart w:id="12" w:name="_Toc229071771"/>
       <w:r>
         <w:t>Módulo 1 — Usuarios</w:t>
       </w:r>
+      <w:bookmarkEnd w:id="12"/>
     </w:p>
     <w:p>
       <w:r>
@@ -3567,14 +2511,16 @@
         <w:t>Requerimiento transversal: aplicación web responsive compatible con múltiples dispositivos</w:t>
       </w:r>
     </w:p>
-    <w:p/>
     <w:p>
       <w:pPr>
         <w:pStyle w:val="Ttulo3"/>
       </w:pPr>
-      <w:r>
+      <w:bookmarkStart w:id="13" w:name="_Toc229071772"/>
+      <w:r>
+        <w:lastRenderedPageBreak/>
         <w:t>Módulo 2 — Productos</w:t>
       </w:r>
+      <w:bookmarkEnd w:id="13"/>
     </w:p>
     <w:p>
       <w:r>
@@ -3633,9 +2579,11 @@
       <w:pPr>
         <w:pStyle w:val="Ttulo3"/>
       </w:pPr>
+      <w:bookmarkStart w:id="14" w:name="_Toc229071773"/>
       <w:r>
         <w:t>Módulo 3 — Carrito y órdenes</w:t>
       </w:r>
+      <w:bookmarkEnd w:id="14"/>
     </w:p>
     <w:p>
       <w:r>
@@ -3683,7 +2631,6 @@
         </w:numPr>
       </w:pPr>
       <w:r>
-        <w:lastRenderedPageBreak/>
         <w:t>Confirmación de orden con notificación al usuario y al administrador</w:t>
       </w:r>
     </w:p>
@@ -3692,9 +2639,11 @@
       <w:pPr>
         <w:pStyle w:val="Ttulo3"/>
       </w:pPr>
+      <w:bookmarkStart w:id="15" w:name="_Toc229071774"/>
       <w:r>
         <w:t>Módulo 4 — Pagos</w:t>
       </w:r>
+      <w:bookmarkEnd w:id="15"/>
     </w:p>
     <w:p>
       <w:r>
@@ -3711,11 +2660,15 @@
       <w:r>
         <w:t xml:space="preserve">Integración de pasarela de pagos en entorno </w:t>
       </w:r>
-      <w:proofErr w:type="spellStart"/>
+      <w:r>
+        <w:t>“</w:t>
+      </w:r>
       <w:r>
         <w:t>sandbox</w:t>
       </w:r>
-      <w:proofErr w:type="spellEnd"/>
+      <w:r>
+        <w:t>”</w:t>
+      </w:r>
     </w:p>
     <w:p>
       <w:pPr>
@@ -3755,9 +2708,12 @@
       <w:pPr>
         <w:pStyle w:val="Ttulo3"/>
       </w:pPr>
-      <w:r>
+      <w:bookmarkStart w:id="16" w:name="_Toc229071775"/>
+      <w:r>
+        <w:lastRenderedPageBreak/>
         <w:t>Módulo 5 — Inventario</w:t>
       </w:r>
+      <w:bookmarkEnd w:id="16"/>
     </w:p>
     <w:p>
       <w:r>
@@ -3835,9 +2791,11 @@
       <w:pPr>
         <w:pStyle w:val="Ttulo3"/>
       </w:pPr>
+      <w:bookmarkStart w:id="17" w:name="_Toc229071776"/>
       <w:r>
         <w:t>Módulo 6 — Domicilios</w:t>
       </w:r>
+      <w:bookmarkEnd w:id="17"/>
     </w:p>
     <w:p>
       <w:r>
@@ -3874,7 +2832,6 @@
         </w:numPr>
       </w:pPr>
       <w:r>
-        <w:lastRenderedPageBreak/>
         <w:t>Asignación de estado al pedido por parte del administrador (pendiente, en preparación, en camino, entregado)</w:t>
       </w:r>
     </w:p>
@@ -3908,9 +2865,12 @@
       <w:pPr>
         <w:pStyle w:val="Ttulo2"/>
       </w:pPr>
-      <w:r>
+      <w:bookmarkStart w:id="18" w:name="_Toc229071777"/>
+      <w:r>
+        <w:lastRenderedPageBreak/>
         <w:t>Exclusiones del alcance</w:t>
       </w:r>
+      <w:bookmarkEnd w:id="18"/>
     </w:p>
     <w:p>
       <w:r>
@@ -3961,85 +2921,60 @@
         <w:t>No incluye integración con sistemas contables o plataformas ERP de terceros</w:t>
       </w:r>
     </w:p>
-    <w:p/>
-    <w:p/>
-    <w:p/>
-    <w:p/>
-    <w:p/>
-    <w:p/>
-    <w:p/>
-    <w:p/>
+    <w:p>
+      <w:pPr>
+        <w:ind w:firstLine="0"/>
+      </w:pPr>
+    </w:p>
     <w:p>
       <w:pPr>
         <w:pStyle w:val="Ttulo1"/>
       </w:pPr>
-      <w:r>
-        <w:lastRenderedPageBreak/>
+      <w:bookmarkStart w:id="19" w:name="_Toc229071778"/>
+      <w:r>
         <w:t>Stack Tecnológico</w:t>
       </w:r>
+      <w:bookmarkEnd w:id="19"/>
     </w:p>
     <w:p>
       <w:pPr>
         <w:pStyle w:val="Ttulo2"/>
       </w:pPr>
-      <w:proofErr w:type="spellStart"/>
+      <w:bookmarkStart w:id="20" w:name="_Toc229071779"/>
       <w:r>
         <w:t>Frontend</w:t>
       </w:r>
-      <w:proofErr w:type="spellEnd"/>
-    </w:p>
-    <w:p>
-      <w:r>
-        <w:t xml:space="preserve">Framework principal: </w:t>
-      </w:r>
-      <w:proofErr w:type="spellStart"/>
-      <w:r>
-        <w:t>Next.Js</w:t>
-      </w:r>
-      <w:proofErr w:type="spellEnd"/>
-    </w:p>
-    <w:p>
-      <w:r>
-        <w:t xml:space="preserve">Leguaje: </w:t>
-      </w:r>
-      <w:proofErr w:type="spellStart"/>
-      <w:r>
-        <w:t>TypeScript</w:t>
-      </w:r>
-      <w:proofErr w:type="spellEnd"/>
-    </w:p>
-    <w:p>
-      <w:r>
-        <w:t xml:space="preserve">Librería Base: </w:t>
-      </w:r>
-      <w:proofErr w:type="spellStart"/>
-      <w:r>
-        <w:t>React</w:t>
-      </w:r>
-      <w:proofErr w:type="spellEnd"/>
-    </w:p>
-    <w:p>
-      <w:r>
-        <w:t xml:space="preserve">Estilos: </w:t>
-      </w:r>
-      <w:proofErr w:type="spellStart"/>
-      <w:r>
-        <w:t>Tailwind</w:t>
-      </w:r>
-      <w:proofErr w:type="spellEnd"/>
-      <w:r>
-        <w:t xml:space="preserve"> CSS</w:t>
+      <w:bookmarkEnd w:id="20"/>
+    </w:p>
+    <w:p>
+      <w:r>
+        <w:t>Framework principal: Next.Js</w:t>
+      </w:r>
+    </w:p>
+    <w:p>
+      <w:r>
+        <w:t>Leguaje: TypeScript</w:t>
+      </w:r>
+    </w:p>
+    <w:p>
+      <w:r>
+        <w:t>Librería Base: React</w:t>
+      </w:r>
+    </w:p>
+    <w:p>
+      <w:r>
+        <w:t>Estilos: Tailwind CSS</w:t>
       </w:r>
     </w:p>
     <w:p>
       <w:pPr>
         <w:pStyle w:val="Ttulo2"/>
       </w:pPr>
-      <w:proofErr w:type="spellStart"/>
+      <w:bookmarkStart w:id="21" w:name="_Toc229071780"/>
       <w:r>
         <w:t>Backend</w:t>
       </w:r>
-      <w:proofErr w:type="spellEnd"/>
+      <w:bookmarkEnd w:id="21"/>
     </w:p>
     <w:p>
       <w:r>
@@ -4055,94 +2990,21 @@
       <w:pPr>
         <w:pStyle w:val="Ttulo2"/>
       </w:pPr>
-      <w:r>
-        <w:t xml:space="preserve">Base de Datos </w:t>
-      </w:r>
-    </w:p>
-    <w:p>
-      <w:r>
-        <w:t xml:space="preserve">Motor: </w:t>
-      </w:r>
-      <w:proofErr w:type="spellStart"/>
-      <w:r>
-        <w:t>MySql</w:t>
-      </w:r>
-      <w:r>
-        <w:t>wind</w:t>
-      </w:r>
-      <w:proofErr w:type="spellEnd"/>
-    </w:p>
-    <w:p>
-      <w:r>
-        <w:t>Preguntas ¡</w:t>
-      </w:r>
-      <w:r>
-        <w:t>demográfica</w:t>
-      </w:r>
-      <w:r>
-        <w:t xml:space="preserve"> puede ser cuantificar respuestas graficas</w:t>
-      </w:r>
-    </w:p>
-    <w:p>
-      <w:r>
-        <w:t xml:space="preserve">Entrevista no se grafica por </w:t>
-      </w:r>
-      <w:r>
-        <w:t>número</w:t>
-      </w:r>
-      <w:r>
-        <w:t xml:space="preserve"> de cantidad interpretamos la respuesta que no sirve</w:t>
-      </w:r>
-    </w:p>
-    <w:p>
-      <w:r>
-        <w:t xml:space="preserve">Requerimientos no </w:t>
-      </w:r>
-      <w:r>
-        <w:t>funcionales</w:t>
-      </w:r>
-    </w:p>
-    <w:p>
-      <w:r>
-        <w:t xml:space="preserve">Seguridad no es el nombre de un </w:t>
-      </w:r>
-      <w:proofErr w:type="spellStart"/>
-      <w:r>
-        <w:t>requirimieto</w:t>
-      </w:r>
-      <w:proofErr w:type="spellEnd"/>
+      <w:bookmarkStart w:id="22" w:name="_Toc229071781"/>
+      <w:r>
+        <w:t>Base de Datos</w:t>
+      </w:r>
+      <w:bookmarkEnd w:id="22"/>
       <w:r>
         <w:t xml:space="preserve"> </w:t>
       </w:r>
-      <w:proofErr w:type="spellStart"/>
-      <w:r>
-        <w:t>nf</w:t>
-      </w:r>
-      <w:proofErr w:type="spellEnd"/>
-      <w:r>
-        <w:t>.</w:t>
-      </w:r>
-    </w:p>
-    <w:p>
-      <w:r>
-        <w:t xml:space="preserve">Tipo de </w:t>
-      </w:r>
-      <w:r>
-        <w:t>Requerimiento</w:t>
-      </w:r>
-      <w:r>
-        <w:t xml:space="preserve"> </w:t>
-      </w:r>
-      <w:r>
-        <w:t xml:space="preserve">en el formato </w:t>
-      </w:r>
-    </w:p>
-    <w:p>
-      <w:r>
-        <w:t xml:space="preserve">Disponibilidad </w:t>
-      </w:r>
-      <w:r>
-        <w:t xml:space="preserve"> </w:t>
+    </w:p>
+    <w:p>
+      <w:r>
+        <w:t>Motor: My</w:t>
+      </w:r>
+      <w:r>
+        <w:t>SQL</w:t>
       </w:r>
     </w:p>
     <w:p/>
@@ -6885,6 +5747,7 @@
   <w:style w:type="character" w:default="1" w:styleId="Fuentedeprrafopredeter">
     <w:name w:val="Default Paragraph Font"/>
     <w:uiPriority w:val="1"/>
+    <w:semiHidden/>
     <w:unhideWhenUsed/>
   </w:style>
   <w:style w:type="table" w:default="1" w:styleId="Tablanormal">
@@ -7742,16 +6605,16 @@
 </file>
 
 <file path=customXml/item1.xml><?xml version="1.0" encoding="utf-8"?>
-<b:Sources xmlns:b="http://schemas.openxmlformats.org/officeDocument/2006/bibliography" xmlns="http://schemas.openxmlformats.org/officeDocument/2006/bibliography" SelectedStyle="\APASixthEditionOfficeOnline.xsl" StyleName="APA" Version="6"/>
-</file>
-
-<file path=customXml/item2.xml><?xml version="1.0" encoding="utf-8"?>
 <?mso-contentType ?>
 <FormTemplates xmlns="http://schemas.microsoft.com/sharepoint/v3/contenttype/forms">
   <Display>DocumentLibraryForm</Display>
   <Edit>DocumentLibraryForm</Edit>
   <New>DocumentLibraryForm</New>
 </FormTemplates>
+</file>
+
+<file path=customXml/item2.xml><?xml version="1.0" encoding="utf-8"?>
+<b:Sources xmlns:b="http://schemas.openxmlformats.org/officeDocument/2006/bibliography" xmlns="http://schemas.openxmlformats.org/officeDocument/2006/bibliography" SelectedStyle="\APASixthEditionOfficeOnline.xsl" StyleName="APA" Version="6"/>
 </file>
 
 <file path=customXml/item3.xml><?xml version="1.0" encoding="utf-8"?>
@@ -7966,17 +6829,17 @@
 </file>
 
 <file path=customXml/itemProps1.xml><?xml version="1.0" encoding="utf-8"?>
-<ds:datastoreItem xmlns:ds="http://schemas.openxmlformats.org/officeDocument/2006/customXml" ds:itemID="{DCF36818-31DD-4AAB-98A0-441B20705CB1}">
+<ds:datastoreItem xmlns:ds="http://schemas.openxmlformats.org/officeDocument/2006/customXml" ds:itemID="{82B997F9-2FBF-4F90-91D1-618B4DA3361D}">
   <ds:schemaRefs>
-    <ds:schemaRef ds:uri="http://schemas.openxmlformats.org/officeDocument/2006/bibliography"/>
+    <ds:schemaRef ds:uri="http://schemas.microsoft.com/sharepoint/v3/contenttype/forms"/>
   </ds:schemaRefs>
 </ds:datastoreItem>
 </file>
 
 <file path=customXml/itemProps2.xml><?xml version="1.0" encoding="utf-8"?>
-<ds:datastoreItem xmlns:ds="http://schemas.openxmlformats.org/officeDocument/2006/customXml" ds:itemID="{82B997F9-2FBF-4F90-91D1-618B4DA3361D}">
+<ds:datastoreItem xmlns:ds="http://schemas.openxmlformats.org/officeDocument/2006/customXml" ds:itemID="{DCF36818-31DD-4AAB-98A0-441B20705CB1}">
   <ds:schemaRefs>
-    <ds:schemaRef ds:uri="http://schemas.microsoft.com/sharepoint/v3/contenttype/forms"/>
+    <ds:schemaRef ds:uri="http://schemas.openxmlformats.org/officeDocument/2006/bibliography"/>
   </ds:schemaRefs>
 </ds:datastoreItem>
 </file>

</xml_diff>

<commit_message>
docs: add docs use cases extends
</commit_message>
<xml_diff>
--- a/TRIMESTRE 1/Componente Metodologico/Farmatech.docx
+++ b/TRIMESTRE 1/Componente Metodologico/Farmatech.docx
@@ -1923,90 +1923,177 @@
       <w:r>
         <w:t xml:space="preserve"> del Problema</w:t>
       </w:r>
+      <w:bookmarkStart w:id="4" w:name="_Toc229071765"/>
       <w:bookmarkEnd w:id="3"/>
     </w:p>
     <w:p>
-      <w:r>
-        <w:t>.</w:t>
-      </w:r>
-      <w:r>
-        <w:rPr>
-          <w:rFonts w:eastAsia="Times New Roman" w:cs="Times New Roman"/>
-          <w:color w:val="auto"/>
-          <w:szCs w:val="24"/>
-          <w:lang w:eastAsia="es-CO"/>
-        </w:rPr>
-        <w:t xml:space="preserve"> </w:t>
-      </w:r>
-      <w:r>
-        <w:t>La droguería Remansó es un negocio microempresarial que enfrenta múltiples limitaciones operativas derivadas de su modelo de gestión tradicional. A continuación, se describen las situaciones concretas que configuran la problemática actual:</w:t>
-      </w:r>
-    </w:p>
-    <w:p>
-      <w:r>
+      <w:pPr>
+        <w:rPr>
+          <w:lang w:val="es-ES"/>
+        </w:rPr>
+      </w:pPr>
+      <w:r>
+        <w:rPr>
+          <w:lang w:val="es-ES"/>
+        </w:rPr>
+        <w:t>La droguería Remansó es un negocio microempresarial ubicado en Bogotá que enfrenta múltiples limitaciones operativas derivadas de su modelo de gestión tradicional. A continuación, se describen las situaciones concretas que configuran la problemática actual, ordenadas según su impacto en la operación del negocio:</w:t>
+      </w:r>
+    </w:p>
+    <w:p>
+      <w:pPr>
         <w:rPr>
           <w:b/>
           <w:bCs/>
-        </w:rPr>
-        <w:t>Gestión de inventario deficiente</w:t>
-      </w:r>
-      <w:r>
-        <w:t xml:space="preserve"> El control de existencias se realiza de forma manual o semiautomática, lo que genera errores frecuentes de registro. Como consecuencia, el negocio queda expuesto a dos riesgos simultáneos: la escasez de productos de alta rotación (desabastecimiento) y la acumulación de productos que terminan vencidos (caducidad), situaciones que representan pérdidas económicas directas.</w:t>
-      </w:r>
-    </w:p>
-    <w:p>
+          <w:lang w:val="es-ES"/>
+        </w:rPr>
+      </w:pPr>
       <w:r>
         <w:rPr>
           <w:b/>
           <w:bCs/>
-        </w:rPr>
-        <w:t>Errores en el proceso de ventas</w:t>
-      </w:r>
-      <w:r>
-        <w:t xml:space="preserve"> Al no existir un sistema automatizado de punto de venta, los registros de las transacciones comerciales son propensos a inconsistencias. Esto dificulta llevar un histórico confiable de ventas y tomar decisiones basadas en datos reales.</w:t>
-      </w:r>
-    </w:p>
-    <w:p>
-      <w:r>
+          <w:lang w:val="es-ES"/>
+        </w:rPr>
+        <w:t>Ausencia de información para la toma de decisiones</w:t>
+      </w:r>
+    </w:p>
+    <w:p>
+      <w:pPr>
+        <w:rPr>
+          <w:lang w:val="es-ES"/>
+        </w:rPr>
+      </w:pPr>
+      <w:r>
+        <w:rPr>
+          <w:lang w:val="es-ES"/>
+        </w:rPr>
+        <w:t>Sin un sistema centralizado, el propietario no cuenta con información oportuna sobre qué productos se venden más, cuáles están próximos a agotarse o cuáles tienen bajo movimiento, lo que impide una gestión estratégica del negocio. Este es el problema raíz que origina o agrava todas las demás situaciones.</w:t>
+      </w:r>
+    </w:p>
+    <w:p>
+      <w:pPr>
         <w:rPr>
           <w:b/>
           <w:bCs/>
-        </w:rPr>
-        <w:t>Canal de venta exclusivamente presencial</w:t>
-      </w:r>
-      <w:r>
-        <w:t xml:space="preserve"> La droguería únicamente atiende clientes que se acercan físicamente al establecimiento. No existe ningún mecanismo que permita a los clientes consultar el catálogo de productos, verificar la disponibilidad de un medicamento o realizar un pedido en línea, lo que limita significativamente el alcance comercial del negocio.</w:t>
-      </w:r>
-    </w:p>
-    <w:p>
-      <w:r>
-        <w:t xml:space="preserve">Pérdida de competitividad frente a grandes cadenas </w:t>
-      </w:r>
-      <w:r>
-        <w:t xml:space="preserve">Las grandes cadenas de farmacias cuentan con plataformas digitales que integran inventario en tiempo real, ventas en línea y </w:t>
-      </w:r>
-      <w:r>
-        <w:lastRenderedPageBreak/>
-        <w:t>atención al cliente multicanal. La ausencia de una solución tecnológica equivalente en Remansó la posiciona en clara desventaja competitiva en un mercado que avanza hacia la transformación digital.</w:t>
-      </w:r>
-    </w:p>
-    <w:p>
+          <w:lang w:val="es-ES"/>
+        </w:rPr>
+      </w:pPr>
       <w:r>
         <w:rPr>
           <w:b/>
           <w:bCs/>
-        </w:rPr>
-        <w:t>Ausencia de información para la toma de decisiones</w:t>
-      </w:r>
-      <w:r>
-        <w:t xml:space="preserve"> Sin un sistema centralizado, el propietario no cuenta con información oportuna sobre qué productos se venden más, cuáles están próximos a agotarse o cuáles tienen bajo movimiento, lo que impide una gestión estratégica del negocio.</w:t>
+          <w:lang w:val="es-ES"/>
+        </w:rPr>
+        <w:t>Gestión de inventario deficiente</w:t>
+      </w:r>
+    </w:p>
+    <w:p>
+      <w:pPr>
+        <w:rPr>
+          <w:lang w:val="es-ES"/>
+        </w:rPr>
+      </w:pPr>
+      <w:r>
+        <w:rPr>
+          <w:lang w:val="es-ES"/>
+        </w:rPr>
+        <w:t>El control de existencias se realiza de forma manual o semiautomática, lo que genera errores frecuentes de registro. Como consecuencia, el negocio queda expuesto a dos riesgos simultáneos: la escasez de productos de alta rotación (desabastecimiento) y la acumulación de productos que terminan vencidos (caducidad), situaciones que representan pérdidas económicas directas.</w:t>
+      </w:r>
+    </w:p>
+    <w:p>
+      <w:pPr>
+        <w:rPr>
+          <w:b/>
+          <w:bCs/>
+          <w:lang w:val="es-ES"/>
+        </w:rPr>
+      </w:pPr>
+      <w:r>
+        <w:rPr>
+          <w:b/>
+          <w:bCs/>
+          <w:lang w:val="es-ES"/>
+        </w:rPr>
+        <w:t>Errores en el proceso de ventas</w:t>
+      </w:r>
+    </w:p>
+    <w:p>
+      <w:pPr>
+        <w:rPr>
+          <w:lang w:val="es-ES"/>
+        </w:rPr>
+      </w:pPr>
+      <w:r>
+        <w:rPr>
+          <w:lang w:val="es-ES"/>
+        </w:rPr>
+        <w:lastRenderedPageBreak/>
+        <w:t>Al no existir un sistema automatizado de punto de venta, los registros de las transacciones comerciales son propensos a inconsistencias. Esto dificulta llevar un histórico confiable de ventas y tomar decisiones basadas en datos reales.</w:t>
+      </w:r>
+    </w:p>
+    <w:p>
+      <w:pPr>
+        <w:rPr>
+          <w:b/>
+          <w:bCs/>
+          <w:lang w:val="es-ES"/>
+        </w:rPr>
+      </w:pPr>
+      <w:r>
+        <w:rPr>
+          <w:b/>
+          <w:bCs/>
+          <w:lang w:val="es-ES"/>
+        </w:rPr>
+        <w:t>Canal de venta exclusivamente presencial</w:t>
+      </w:r>
+    </w:p>
+    <w:p>
+      <w:pPr>
+        <w:rPr>
+          <w:lang w:val="es-ES"/>
+        </w:rPr>
+      </w:pPr>
+      <w:r>
+        <w:rPr>
+          <w:lang w:val="es-ES"/>
+        </w:rPr>
+        <w:t>La droguería únicamente atiende clientes que se acercan físicamente al establecimiento. No existe ningún mecanismo que permita a los clientes consultar el catálogo de productos, verificar la disponibilidad de un medicamento o realizar un pedido en línea, lo que limita significativamente el alcance comercial del negocio.</w:t>
+      </w:r>
+    </w:p>
+    <w:p>
+      <w:pPr>
+        <w:rPr>
+          <w:b/>
+          <w:bCs/>
+          <w:lang w:val="es-ES"/>
+        </w:rPr>
+      </w:pPr>
+      <w:r>
+        <w:rPr>
+          <w:b/>
+          <w:bCs/>
+          <w:lang w:val="es-ES"/>
+        </w:rPr>
+        <w:t>Pérdida de competitividad frente a grandes cadenas</w:t>
+      </w:r>
+    </w:p>
+    <w:p>
+      <w:pPr>
+        <w:rPr>
+          <w:lang w:val="es-ES"/>
+        </w:rPr>
+      </w:pPr>
+      <w:r>
+        <w:rPr>
+          <w:lang w:val="es-ES"/>
+        </w:rPr>
+        <w:t>Las grandes cadenas de farmacias cuentan con plataformas digitales que integran inventario en tiempo real, ventas en línea y atención al cliente multicanal. La ausencia de una solución tecnológica equivalente en Remansó la posiciona en clara desventaja competitiva en un mercado que avanza hacia la transformación digital.</w:t>
       </w:r>
     </w:p>
     <w:p>
       <w:pPr>
         <w:pStyle w:val="Ttulo1"/>
       </w:pPr>
-      <w:bookmarkStart w:id="4" w:name="_Toc229071765"/>
       <w:r>
         <w:t>Pregunta del Proyecto</w:t>
       </w:r>
@@ -2035,54 +2122,6 @@
       </w:r>
     </w:p>
     <w:p/>
-    <w:p>
-      <w:pPr>
-        <w:ind w:firstLine="0"/>
-        <w:rPr>
-          <w:lang w:val="es-ES"/>
-        </w:rPr>
-      </w:pPr>
-    </w:p>
-    <w:p>
-      <w:pPr>
-        <w:ind w:firstLine="0"/>
-        <w:rPr>
-          <w:lang w:val="es-ES"/>
-        </w:rPr>
-      </w:pPr>
-    </w:p>
-    <w:p>
-      <w:pPr>
-        <w:ind w:firstLine="0"/>
-        <w:rPr>
-          <w:lang w:val="es-ES"/>
-        </w:rPr>
-      </w:pPr>
-    </w:p>
-    <w:p>
-      <w:pPr>
-        <w:ind w:firstLine="0"/>
-        <w:rPr>
-          <w:lang w:val="es-ES"/>
-        </w:rPr>
-      </w:pPr>
-    </w:p>
-    <w:p>
-      <w:pPr>
-        <w:ind w:firstLine="0"/>
-        <w:rPr>
-          <w:lang w:val="es-ES"/>
-        </w:rPr>
-      </w:pPr>
-    </w:p>
-    <w:p>
-      <w:pPr>
-        <w:ind w:firstLine="0"/>
-        <w:rPr>
-          <w:lang w:val="es-ES"/>
-        </w:rPr>
-      </w:pPr>
-    </w:p>
     <w:p>
       <w:pPr>
         <w:ind w:firstLine="0"/>
@@ -6605,19 +6644,10 @@
 </file>
 
 <file path=customXml/item1.xml><?xml version="1.0" encoding="utf-8"?>
-<?mso-contentType ?>
-<FormTemplates xmlns="http://schemas.microsoft.com/sharepoint/v3/contenttype/forms">
-  <Display>DocumentLibraryForm</Display>
-  <Edit>DocumentLibraryForm</Edit>
-  <New>DocumentLibraryForm</New>
-</FormTemplates>
+<b:Sources xmlns:b="http://schemas.openxmlformats.org/officeDocument/2006/bibliography" xmlns="http://schemas.openxmlformats.org/officeDocument/2006/bibliography" SelectedStyle="\APASixthEditionOfficeOnline.xsl" StyleName="APA" Version="6"/>
 </file>
 
 <file path=customXml/item2.xml><?xml version="1.0" encoding="utf-8"?>
-<b:Sources xmlns:b="http://schemas.openxmlformats.org/officeDocument/2006/bibliography" xmlns="http://schemas.openxmlformats.org/officeDocument/2006/bibliography" SelectedStyle="\APASixthEditionOfficeOnline.xsl" StyleName="APA" Version="6"/>
-</file>
-
-<file path=customXml/item3.xml><?xml version="1.0" encoding="utf-8"?>
 <ct:contentTypeSchema xmlns:ct="http://schemas.microsoft.com/office/2006/metadata/contentType" xmlns:ma="http://schemas.microsoft.com/office/2006/metadata/properties/metaAttributes" ct:_="" ma:_="" ma:contentTypeName="Documento" ma:contentTypeID="0x0101005C848814CB8D5B45BDE447D5107B79B0" ma:contentTypeVersion="11" ma:contentTypeDescription="Crear nuevo documento." ma:contentTypeScope="" ma:versionID="bc084e518ff7a40c63a45e2bda450718">
   <xsd:schema xmlns:xsd="http://www.w3.org/2001/XMLSchema" xmlns:xs="http://www.w3.org/2001/XMLSchema" xmlns:p="http://schemas.microsoft.com/office/2006/metadata/properties" xmlns:ns2="2ef287bc-8651-49b9-91f6-6f8ae78755d0" xmlns:ns3="b087e0fe-0a80-44b1-af84-83d826b5bd0b" targetNamespace="http://schemas.microsoft.com/office/2006/metadata/properties" ma:root="true" ma:fieldsID="38c7cf8001a1de99eed0b42779cef1bf" ns2:_="" ns3:_="">
     <xsd:import namespace="2ef287bc-8651-49b9-91f6-6f8ae78755d0"/>
@@ -6828,15 +6858,16 @@
 </ct:contentTypeSchema>
 </file>
 
-<file path=customXml/itemProps1.xml><?xml version="1.0" encoding="utf-8"?>
-<ds:datastoreItem xmlns:ds="http://schemas.openxmlformats.org/officeDocument/2006/customXml" ds:itemID="{82B997F9-2FBF-4F90-91D1-618B4DA3361D}">
-  <ds:schemaRefs>
-    <ds:schemaRef ds:uri="http://schemas.microsoft.com/sharepoint/v3/contenttype/forms"/>
-  </ds:schemaRefs>
-</ds:datastoreItem>
+<file path=customXml/item3.xml><?xml version="1.0" encoding="utf-8"?>
+<?mso-contentType ?>
+<FormTemplates xmlns="http://schemas.microsoft.com/sharepoint/v3/contenttype/forms">
+  <Display>DocumentLibraryForm</Display>
+  <Edit>DocumentLibraryForm</Edit>
+  <New>DocumentLibraryForm</New>
+</FormTemplates>
 </file>
 
-<file path=customXml/itemProps2.xml><?xml version="1.0" encoding="utf-8"?>
+<file path=customXml/itemProps1.xml><?xml version="1.0" encoding="utf-8"?>
 <ds:datastoreItem xmlns:ds="http://schemas.openxmlformats.org/officeDocument/2006/customXml" ds:itemID="{DCF36818-31DD-4AAB-98A0-441B20705CB1}">
   <ds:schemaRefs>
     <ds:schemaRef ds:uri="http://schemas.openxmlformats.org/officeDocument/2006/bibliography"/>
@@ -6844,7 +6875,7 @@
 </ds:datastoreItem>
 </file>
 
-<file path=customXml/itemProps3.xml><?xml version="1.0" encoding="utf-8"?>
+<file path=customXml/itemProps2.xml><?xml version="1.0" encoding="utf-8"?>
 <ds:datastoreItem xmlns:ds="http://schemas.openxmlformats.org/officeDocument/2006/customXml" ds:itemID="{788D90F1-CEA8-40A8-8330-148267D0819A}">
   <ds:schemaRefs>
     <ds:schemaRef ds:uri="http://schemas.microsoft.com/office/2006/metadata/contentType"/>
@@ -6861,4 +6892,12 @@
     <ds:schemaRef ds:uri="http://schemas.microsoft.com/internal/obd"/>
   </ds:schemaRefs>
 </ds:datastoreItem>
+</file>
+
+<file path=customXml/itemProps3.xml><?xml version="1.0" encoding="utf-8"?>
+<ds:datastoreItem xmlns:ds="http://schemas.openxmlformats.org/officeDocument/2006/customXml" ds:itemID="{82B997F9-2FBF-4F90-91D1-618B4DA3361D}">
+  <ds:schemaRefs>
+    <ds:schemaRef ds:uri="http://schemas.microsoft.com/sharepoint/v3/contenttype/forms"/>
+  </ds:schemaRefs>
+</ds:datastoreItem>
 </file>
</xml_diff>